<commit_message>
nmv 14 07 2026
</commit_message>
<xml_diff>
--- a/TS-Kramam/TS-3.3/TS 3.3 Malayalam Krama Paatam Corrections.docx
+++ b/TS-Kramam/TS-3.3/TS 3.3 Malayalam Krama Paatam Corrections.docx
@@ -1,6 +1,6 @@
 
 <file path=word/document.xml><?xml version="1.0" encoding="utf-8"?>
-<w:document xmlns:wpc="http://schemas.microsoft.com/office/word/2010/wordprocessingCanvas" xmlns:cx="http://schemas.microsoft.com/office/drawing/2014/chartex" xmlns:cx1="http://schemas.microsoft.com/office/drawing/2015/9/8/chartex" xmlns:mc="http://schemas.openxmlformats.org/markup-compatibility/2006" xmlns:o="urn:schemas-microsoft-com:office:office" xmlns:r="http://schemas.openxmlformats.org/officeDocument/2006/relationships" xmlns:m="http://schemas.openxmlformats.org/officeDocument/2006/math" xmlns:v="urn:schemas-microsoft-com:vml" xmlns:wp14="http://schemas.microsoft.com/office/word/2010/wordprocessingDrawing" xmlns:wp="http://schemas.openxmlformats.org/drawingml/2006/wordprocessingDrawing" xmlns:w10="urn:schemas-microsoft-com:office:word" xmlns:w="http://schemas.openxmlformats.org/wordprocessingml/2006/main" xmlns:w14="http://schemas.microsoft.com/office/word/2010/wordml" xmlns:w15="http://schemas.microsoft.com/office/word/2012/wordml" xmlns:w16se="http://schemas.microsoft.com/office/word/2015/wordml/symex" xmlns:wpg="http://schemas.microsoft.com/office/word/2010/wordprocessingGroup" xmlns:wpi="http://schemas.microsoft.com/office/word/2010/wordprocessingInk" xmlns:wne="http://schemas.microsoft.com/office/word/2006/wordml" xmlns:wps="http://schemas.microsoft.com/office/word/2010/wordprocessingShape" mc:Ignorable="w14 w15 w16se wp14">
+<w:document xmlns:wpc="http://schemas.microsoft.com/office/word/2010/wordprocessingCanvas" xmlns:cx="http://schemas.microsoft.com/office/drawing/2014/chartex" xmlns:cx1="http://schemas.microsoft.com/office/drawing/2015/9/8/chartex" xmlns:cx2="http://schemas.microsoft.com/office/drawing/2015/10/21/chartex" xmlns:cx3="http://schemas.microsoft.com/office/drawing/2016/5/9/chartex" xmlns:cx4="http://schemas.microsoft.com/office/drawing/2016/5/10/chartex" xmlns:cx5="http://schemas.microsoft.com/office/drawing/2016/5/11/chartex" xmlns:cx6="http://schemas.microsoft.com/office/drawing/2016/5/12/chartex" xmlns:cx7="http://schemas.microsoft.com/office/drawing/2016/5/13/chartex" xmlns:cx8="http://schemas.microsoft.com/office/drawing/2016/5/14/chartex" xmlns:mc="http://schemas.openxmlformats.org/markup-compatibility/2006" xmlns:aink="http://schemas.microsoft.com/office/drawing/2016/ink" xmlns:am3d="http://schemas.microsoft.com/office/drawing/2017/model3d" xmlns:o="urn:schemas-microsoft-com:office:office" xmlns:oel="http://schemas.microsoft.com/office/2019/extlst" xmlns:r="http://schemas.openxmlformats.org/officeDocument/2006/relationships" xmlns:m="http://schemas.openxmlformats.org/officeDocument/2006/math" xmlns:v="urn:schemas-microsoft-com:vml" xmlns:wp14="http://schemas.microsoft.com/office/word/2010/wordprocessingDrawing" xmlns:wp="http://schemas.openxmlformats.org/drawingml/2006/wordprocessingDrawing" xmlns:w10="urn:schemas-microsoft-com:office:word" xmlns:w="http://schemas.openxmlformats.org/wordprocessingml/2006/main" xmlns:w14="http://schemas.microsoft.com/office/word/2010/wordml" xmlns:w15="http://schemas.microsoft.com/office/word/2012/wordml" xmlns:w16cex="http://schemas.microsoft.com/office/word/2018/wordml/cex" xmlns:w16cid="http://schemas.microsoft.com/office/word/2016/wordml/cid" xmlns:w16="http://schemas.microsoft.com/office/word/2018/wordml" xmlns:w16du="http://schemas.microsoft.com/office/word/2023/wordml/word16du" xmlns:w16sdtdh="http://schemas.microsoft.com/office/word/2020/wordml/sdtdatahash" xmlns:w16sdtfl="http://schemas.microsoft.com/office/word/2024/wordml/sdtformatlock" xmlns:w16se="http://schemas.microsoft.com/office/word/2015/wordml/symex" xmlns:wpg="http://schemas.microsoft.com/office/word/2010/wordprocessingGroup" xmlns:wpi="http://schemas.microsoft.com/office/word/2010/wordprocessingInk" xmlns:wne="http://schemas.microsoft.com/office/word/2006/wordml" xmlns:wps="http://schemas.microsoft.com/office/word/2010/wordprocessingShape" mc:Ignorable="w14 w15 w16se w16cid w16 w16cex w16sdtdh w16sdtfl w16du wp14">
   <w:body>
     <w:p>
       <w:pPr>
@@ -24,7 +24,6 @@
         </w:rPr>
         <w:t xml:space="preserve">TS </w:t>
       </w:r>
-      <w:proofErr w:type="spellStart"/>
       <w:r>
         <w:rPr>
           <w:b/>
@@ -35,7 +34,6 @@
         </w:rPr>
         <w:t>Krama</w:t>
       </w:r>
-      <w:proofErr w:type="spellEnd"/>
       <w:r>
         <w:rPr>
           <w:b/>
@@ -44,9 +42,28 @@
           <w:szCs w:val="32"/>
           <w:u w:val="single"/>
         </w:rPr>
+        <w:t xml:space="preserve"> Paatam – TS </w:t>
+      </w:r>
+      <w:r>
+        <w:rPr>
+          <w:b/>
+          <w:bCs/>
+          <w:sz w:val="32"/>
+          <w:szCs w:val="32"/>
+          <w:u w:val="single"/>
+        </w:rPr>
+        <w:t>3.3</w:t>
+      </w:r>
+      <w:r>
+        <w:rPr>
+          <w:b/>
+          <w:bCs/>
+          <w:sz w:val="32"/>
+          <w:szCs w:val="32"/>
+          <w:u w:val="single"/>
+        </w:rPr>
         <w:t xml:space="preserve"> </w:t>
       </w:r>
-      <w:proofErr w:type="spellStart"/>
       <w:r>
         <w:rPr>
           <w:b/>
@@ -55,9 +72,8 @@
           <w:szCs w:val="32"/>
           <w:u w:val="single"/>
         </w:rPr>
-        <w:t>Paatam</w:t>
-      </w:r>
-      <w:proofErr w:type="spellEnd"/>
+        <w:t>Malayalam</w:t>
+      </w:r>
       <w:r>
         <w:rPr>
           <w:b/>
@@ -66,7 +82,1203 @@
           <w:szCs w:val="32"/>
           <w:u w:val="single"/>
         </w:rPr>
-        <w:t xml:space="preserve"> – TS </w:t>
+        <w:t xml:space="preserve"> Corrections –</w:t>
+      </w:r>
+      <w:r>
+        <w:rPr>
+          <w:b/>
+          <w:bCs/>
+          <w:sz w:val="32"/>
+          <w:szCs w:val="32"/>
+          <w:u w:val="single"/>
+        </w:rPr>
+        <w:t xml:space="preserve"> </w:t>
+      </w:r>
+      <w:r>
+        <w:rPr>
+          <w:b/>
+          <w:bCs/>
+          <w:sz w:val="32"/>
+          <w:szCs w:val="32"/>
+          <w:u w:val="single"/>
+        </w:rPr>
+        <w:t xml:space="preserve">Observed till </w:t>
+      </w:r>
+      <w:r>
+        <w:rPr>
+          <w:b/>
+          <w:bCs/>
+          <w:color w:val="EE0000"/>
+          <w:sz w:val="32"/>
+          <w:szCs w:val="32"/>
+          <w:highlight w:val="yellow"/>
+          <w:u w:val="single"/>
+        </w:rPr>
+        <w:t>xxxxxxx</w:t>
+      </w:r>
+    </w:p>
+    <w:p>
+      <w:pPr>
+        <w:spacing w:before="0" w:line="240" w:lineRule="auto"/>
+        <w:jc w:val="center"/>
+        <w:rPr>
+          <w:b/>
+          <w:szCs w:val="24"/>
+        </w:rPr>
+      </w:pPr>
+      <w:r>
+        <w:rPr>
+          <w:b/>
+          <w:szCs w:val="24"/>
+        </w:rPr>
+        <w:t>(ignore those which are already incorporated in your book’s version and date)</w:t>
+      </w:r>
+    </w:p>
+    <w:tbl>
+      <w:tblPr>
+        <w:tblW w:w="13970" w:type="dxa"/>
+        <w:tblInd w:w="-792" w:type="dxa"/>
+        <w:tblBorders>
+          <w:top w:val="single" w:sz="4" w:space="0" w:color="000000"/>
+          <w:left w:val="single" w:sz="4" w:space="0" w:color="000000"/>
+          <w:bottom w:val="single" w:sz="4" w:space="0" w:color="000000"/>
+          <w:right w:val="single" w:sz="4" w:space="0" w:color="000000"/>
+          <w:insideH w:val="single" w:sz="4" w:space="0" w:color="000000"/>
+          <w:insideV w:val="single" w:sz="4" w:space="0" w:color="000000"/>
+        </w:tblBorders>
+        <w:tblLook w:val="04A0" w:firstRow="1" w:lastRow="0" w:firstColumn="1" w:lastColumn="0" w:noHBand="0" w:noVBand="1"/>
+      </w:tblPr>
+      <w:tblGrid>
+        <w:gridCol w:w="4048"/>
+        <w:gridCol w:w="4819"/>
+        <w:gridCol w:w="5103"/>
+      </w:tblGrid>
+      <w:tr>
+        <w:tc>
+          <w:tcPr>
+            <w:tcW w:w="4048" w:type="dxa"/>
+          </w:tcPr>
+          <w:p>
+            <w:pPr>
+              <w:spacing w:before="0" w:line="240" w:lineRule="auto"/>
+              <w:jc w:val="center"/>
+              <w:rPr>
+                <w:b/>
+                <w:bCs/>
+                <w:sz w:val="32"/>
+                <w:szCs w:val="32"/>
+              </w:rPr>
+            </w:pPr>
+            <w:r>
+              <w:rPr>
+                <w:b/>
+                <w:bCs/>
+                <w:sz w:val="32"/>
+                <w:szCs w:val="32"/>
+              </w:rPr>
+              <w:t>Section, Paragraph</w:t>
+            </w:r>
+          </w:p>
+          <w:p>
+            <w:pPr>
+              <w:spacing w:before="0" w:line="240" w:lineRule="auto"/>
+              <w:jc w:val="center"/>
+              <w:rPr>
+                <w:b/>
+                <w:bCs/>
+                <w:sz w:val="32"/>
+                <w:szCs w:val="32"/>
+              </w:rPr>
+            </w:pPr>
+            <w:r>
+              <w:rPr>
+                <w:b/>
+                <w:bCs/>
+                <w:sz w:val="32"/>
+                <w:szCs w:val="32"/>
+              </w:rPr>
+              <w:t>Reference</w:t>
+            </w:r>
+          </w:p>
+        </w:tc>
+        <w:tc>
+          <w:tcPr>
+            <w:tcW w:w="4819" w:type="dxa"/>
+          </w:tcPr>
+          <w:p>
+            <w:pPr>
+              <w:spacing w:before="0" w:line="240" w:lineRule="auto"/>
+              <w:jc w:val="center"/>
+              <w:rPr>
+                <w:b/>
+                <w:bCs/>
+                <w:sz w:val="32"/>
+                <w:szCs w:val="32"/>
+              </w:rPr>
+            </w:pPr>
+            <w:r>
+              <w:rPr>
+                <w:b/>
+                <w:bCs/>
+                <w:sz w:val="32"/>
+                <w:szCs w:val="32"/>
+              </w:rPr>
+              <w:t>As Printed</w:t>
+            </w:r>
+          </w:p>
+        </w:tc>
+        <w:tc>
+          <w:tcPr>
+            <w:tcW w:w="5103" w:type="dxa"/>
+          </w:tcPr>
+          <w:p>
+            <w:pPr>
+              <w:spacing w:before="0" w:line="240" w:lineRule="auto"/>
+              <w:ind w:right="-18"/>
+              <w:jc w:val="center"/>
+              <w:rPr>
+                <w:b/>
+                <w:bCs/>
+                <w:sz w:val="32"/>
+                <w:szCs w:val="32"/>
+              </w:rPr>
+            </w:pPr>
+            <w:r>
+              <w:rPr>
+                <w:b/>
+                <w:bCs/>
+                <w:sz w:val="32"/>
+                <w:szCs w:val="32"/>
+              </w:rPr>
+              <w:t>To be read as or corrected as</w:t>
+            </w:r>
+          </w:p>
+        </w:tc>
+      </w:tr>
+    </w:tbl>
+    <w:p>
+      <w:pPr>
+        <w:spacing w:before="0" w:line="240" w:lineRule="auto"/>
+        <w:rPr>
+          <w:vanish/>
+          <w:sz w:val="32"/>
+          <w:szCs w:val="32"/>
+        </w:rPr>
+      </w:pPr>
+    </w:p>
+    <w:tbl>
+      <w:tblPr>
+        <w:tblW w:w="13970" w:type="dxa"/>
+        <w:tblInd w:w="-792" w:type="dxa"/>
+        <w:tblBorders>
+          <w:top w:val="single" w:sz="4" w:space="0" w:color="000000"/>
+          <w:left w:val="single" w:sz="4" w:space="0" w:color="000000"/>
+          <w:bottom w:val="single" w:sz="4" w:space="0" w:color="000000"/>
+          <w:right w:val="single" w:sz="4" w:space="0" w:color="000000"/>
+          <w:insideH w:val="single" w:sz="4" w:space="0" w:color="000000"/>
+          <w:insideV w:val="single" w:sz="4" w:space="0" w:color="000000"/>
+        </w:tblBorders>
+        <w:tblLook w:val="04A0" w:firstRow="1" w:lastRow="0" w:firstColumn="1" w:lastColumn="0" w:noHBand="0" w:noVBand="1"/>
+      </w:tblPr>
+      <w:tblGrid>
+        <w:gridCol w:w="4048"/>
+        <w:gridCol w:w="4819"/>
+        <w:gridCol w:w="5103"/>
+      </w:tblGrid>
+      <w:tr>
+        <w:trPr>
+          <w:trHeight w:val="1569"/>
+        </w:trPr>
+        <w:tc>
+          <w:tcPr>
+            <w:tcW w:w="4048" w:type="dxa"/>
+          </w:tcPr>
+          <w:p>
+            <w:pPr>
+              <w:widowControl w:val="0"/>
+              <w:tabs>
+                <w:tab w:val="left" w:pos="993"/>
+              </w:tabs>
+              <w:autoSpaceDE w:val="0"/>
+              <w:autoSpaceDN w:val="0"/>
+              <w:adjustRightInd w:val="0"/>
+              <w:spacing w:before="0" w:line="240" w:lineRule="auto"/>
+              <w:ind w:right="297"/>
+              <w:rPr>
+                <w:rFonts w:cs="Arial"/>
+                <w:b/>
+                <w:sz w:val="28"/>
+                <w:szCs w:val="32"/>
+              </w:rPr>
+            </w:pPr>
+            <w:r>
+              <w:rPr>
+                <w:rFonts w:cs="Arial"/>
+                <w:b/>
+                <w:sz w:val="28"/>
+                <w:szCs w:val="32"/>
+              </w:rPr>
+              <w:t>T.S.3.3.</w:t>
+            </w:r>
+            <w:r>
+              <w:rPr>
+                <w:rFonts w:cs="Arial"/>
+                <w:b/>
+                <w:sz w:val="28"/>
+                <w:szCs w:val="32"/>
+              </w:rPr>
+              <w:t>3.3</w:t>
+            </w:r>
+            <w:r>
+              <w:rPr>
+                <w:rFonts w:cs="Arial"/>
+                <w:b/>
+                <w:sz w:val="28"/>
+                <w:szCs w:val="32"/>
+              </w:rPr>
+              <w:t xml:space="preserve"> – Kramam</w:t>
+            </w:r>
+          </w:p>
+          <w:p>
+            <w:pPr>
+              <w:widowControl w:val="0"/>
+              <w:tabs>
+                <w:tab w:val="left" w:pos="993"/>
+              </w:tabs>
+              <w:autoSpaceDE w:val="0"/>
+              <w:autoSpaceDN w:val="0"/>
+              <w:adjustRightInd w:val="0"/>
+              <w:spacing w:before="0" w:line="240" w:lineRule="auto"/>
+              <w:ind w:right="297"/>
+              <w:rPr>
+                <w:rFonts w:cs="Arial"/>
+                <w:b/>
+                <w:sz w:val="28"/>
+                <w:szCs w:val="32"/>
+              </w:rPr>
+            </w:pPr>
+            <w:r>
+              <w:rPr>
+                <w:rFonts w:cs="Arial"/>
+                <w:b/>
+                <w:sz w:val="28"/>
+                <w:szCs w:val="32"/>
+              </w:rPr>
+              <w:t xml:space="preserve">Krama Vaakyam No. - </w:t>
+            </w:r>
+            <w:r>
+              <w:rPr>
+                <w:rFonts w:cs="Arial"/>
+                <w:b/>
+                <w:sz w:val="28"/>
+                <w:szCs w:val="32"/>
+              </w:rPr>
+              <w:t>9</w:t>
+            </w:r>
+          </w:p>
+          <w:p>
+            <w:pPr>
+              <w:widowControl w:val="0"/>
+              <w:tabs>
+                <w:tab w:val="left" w:pos="993"/>
+              </w:tabs>
+              <w:autoSpaceDE w:val="0"/>
+              <w:autoSpaceDN w:val="0"/>
+              <w:adjustRightInd w:val="0"/>
+              <w:spacing w:before="0" w:line="240" w:lineRule="auto"/>
+              <w:ind w:right="297"/>
+              <w:rPr>
+                <w:rFonts w:cs="Arial"/>
+                <w:b/>
+                <w:sz w:val="28"/>
+                <w:szCs w:val="32"/>
+              </w:rPr>
+            </w:pPr>
+            <w:r>
+              <w:rPr>
+                <w:rFonts w:cs="Arial"/>
+                <w:b/>
+                <w:sz w:val="28"/>
+                <w:szCs w:val="32"/>
+              </w:rPr>
+              <w:t>Panchaati No</w:t>
+            </w:r>
+            <w:r>
+              <w:rPr>
+                <w:rFonts w:cs="Arial"/>
+                <w:b/>
+                <w:szCs w:val="32"/>
+              </w:rPr>
+              <w:t>. -</w:t>
+            </w:r>
+            <w:r>
+              <w:rPr>
+                <w:rFonts w:cs="Arial"/>
+                <w:b/>
+                <w:sz w:val="28"/>
+                <w:szCs w:val="28"/>
+              </w:rPr>
+              <w:t xml:space="preserve"> </w:t>
+            </w:r>
+            <w:r>
+              <w:rPr>
+                <w:rFonts w:cs="Arial"/>
+                <w:b/>
+                <w:sz w:val="28"/>
+                <w:szCs w:val="28"/>
+              </w:rPr>
+              <w:t>7</w:t>
+            </w:r>
+          </w:p>
+        </w:tc>
+        <w:tc>
+          <w:tcPr>
+            <w:tcW w:w="4819" w:type="dxa"/>
+          </w:tcPr>
+          <w:p>
+            <w:pPr>
+              <w:widowControl w:val="0"/>
+              <w:autoSpaceDE w:val="0"/>
+              <w:autoSpaceDN w:val="0"/>
+              <w:adjustRightInd w:val="0"/>
+              <w:spacing w:before="0" w:line="240" w:lineRule="auto"/>
+              <w:rPr>
+                <w:rFonts w:ascii="BRH Devanagari Extra" w:hAnsi="BRH Devanagari Extra" w:cs="BRH Devanagari Extra"/>
+                <w:color w:val="000000"/>
+                <w:sz w:val="40"/>
+                <w:szCs w:val="40"/>
+              </w:rPr>
+            </w:pPr>
+            <w:r>
+              <w:rPr>
+                <w:rFonts w:ascii="BRH Malayalam Extra" w:hAnsi="BRH Malayalam Extra" w:cs="BRH Malayalam Extra"/>
+                <w:color w:val="000000"/>
+                <w:sz w:val="40"/>
+                <w:szCs w:val="40"/>
+              </w:rPr>
+              <w:t>¥sx</w:t>
+            </w:r>
+            <w:r>
+              <w:rPr>
+                <w:rFonts w:ascii="BRH Malayalam Extra" w:hAnsi="BRH Malayalam Extra" w:cs="BRH Malayalam Extra"/>
+                <w:b/>
+                <w:color w:val="000000"/>
+                <w:sz w:val="33"/>
+                <w:szCs w:val="40"/>
+              </w:rPr>
+              <w:t>–</w:t>
+            </w:r>
+            <w:r>
+              <w:rPr>
+                <w:rFonts w:ascii="BRH Malayalam Extra" w:hAnsi="BRH Malayalam Extra" w:cs="BRH Malayalam Extra"/>
+                <w:color w:val="000000"/>
+                <w:sz w:val="40"/>
+                <w:szCs w:val="40"/>
+              </w:rPr>
+              <w:t>i</w:t>
+            </w:r>
+            <w:r>
+              <w:rPr>
+                <w:rFonts w:ascii="BRH Malayalam Extra" w:hAnsi="BRH Malayalam Extra" w:cs="BRH Malayalam Extra"/>
+                <w:b/>
+                <w:color w:val="000000"/>
+                <w:sz w:val="33"/>
+                <w:szCs w:val="40"/>
+              </w:rPr>
+              <w:t>–</w:t>
+            </w:r>
+            <w:r>
+              <w:rPr>
+                <w:rFonts w:ascii="BRH Malayalam Extra" w:hAnsi="BRH Malayalam Extra" w:cs="BRH Malayalam Extra"/>
+                <w:color w:val="000000"/>
+                <w:sz w:val="40"/>
+                <w:szCs w:val="40"/>
+              </w:rPr>
+              <w:t xml:space="preserve"> ¤¤öZræ¡—¥hd | ¤¤öZ</w:t>
+            </w:r>
+            <w:r>
+              <w:rPr>
+                <w:rFonts w:ascii="BRH Malayalam Extra" w:hAnsi="BRH Malayalam Extra" w:cs="BRH Malayalam Extra"/>
+                <w:color w:val="000000"/>
+                <w:sz w:val="40"/>
+                <w:szCs w:val="40"/>
+                <w:highlight w:val="yellow"/>
+              </w:rPr>
+              <w:t>r</w:t>
+            </w:r>
+            <w:r>
+              <w:rPr>
+                <w:rFonts w:ascii="BRH Malayalam Extra" w:hAnsi="BRH Malayalam Extra" w:cs="BRH Malayalam Extra"/>
+                <w:color w:val="000000"/>
+                <w:sz w:val="40"/>
+                <w:szCs w:val="40"/>
+              </w:rPr>
+              <w:t>æ—¥hd</w:t>
+            </w:r>
+            <w:r>
+              <w:rPr>
+                <w:rFonts w:ascii="BRH Malayalam Extra" w:hAnsi="BRH Malayalam Extra" w:cs="BRH Malayalam Extra"/>
+                <w:b/>
+                <w:color w:val="000000"/>
+                <w:sz w:val="33"/>
+                <w:szCs w:val="40"/>
+              </w:rPr>
+              <w:t>–</w:t>
+            </w:r>
+            <w:r>
+              <w:rPr>
+                <w:rFonts w:ascii="BRH Malayalam Extra" w:hAnsi="BRH Malayalam Extra" w:cs="BRH Malayalam Extra"/>
+                <w:color w:val="000000"/>
+                <w:sz w:val="40"/>
+                <w:szCs w:val="40"/>
+              </w:rPr>
+              <w:t xml:space="preserve"> QÉ—sx |</w:t>
+            </w:r>
+          </w:p>
+        </w:tc>
+        <w:tc>
+          <w:tcPr>
+            <w:tcW w:w="5103" w:type="dxa"/>
+          </w:tcPr>
+          <w:p>
+            <w:pPr>
+              <w:widowControl w:val="0"/>
+              <w:autoSpaceDE w:val="0"/>
+              <w:autoSpaceDN w:val="0"/>
+              <w:adjustRightInd w:val="0"/>
+              <w:spacing w:before="0" w:line="240" w:lineRule="auto"/>
+              <w:rPr>
+                <w:rFonts w:ascii="BRH Malayalam Extra" w:hAnsi="BRH Malayalam Extra" w:cs="BRH Malayalam Extra"/>
+                <w:color w:val="000000"/>
+                <w:sz w:val="40"/>
+                <w:szCs w:val="40"/>
+              </w:rPr>
+            </w:pPr>
+            <w:r>
+              <w:rPr>
+                <w:rFonts w:ascii="BRH Malayalam Extra" w:hAnsi="BRH Malayalam Extra" w:cs="BRH Malayalam Extra"/>
+                <w:color w:val="000000"/>
+                <w:sz w:val="40"/>
+                <w:szCs w:val="40"/>
+              </w:rPr>
+              <w:t>¥sx</w:t>
+            </w:r>
+            <w:r>
+              <w:rPr>
+                <w:rFonts w:ascii="BRH Malayalam Extra" w:hAnsi="BRH Malayalam Extra" w:cs="BRH Malayalam Extra"/>
+                <w:b/>
+                <w:color w:val="000000"/>
+                <w:sz w:val="33"/>
+                <w:szCs w:val="40"/>
+              </w:rPr>
+              <w:t>–</w:t>
+            </w:r>
+            <w:r>
+              <w:rPr>
+                <w:rFonts w:ascii="BRH Malayalam Extra" w:hAnsi="BRH Malayalam Extra" w:cs="BRH Malayalam Extra"/>
+                <w:color w:val="000000"/>
+                <w:sz w:val="40"/>
+                <w:szCs w:val="40"/>
+              </w:rPr>
+              <w:t>i</w:t>
+            </w:r>
+            <w:r>
+              <w:rPr>
+                <w:rFonts w:ascii="BRH Malayalam Extra" w:hAnsi="BRH Malayalam Extra" w:cs="BRH Malayalam Extra"/>
+                <w:b/>
+                <w:color w:val="000000"/>
+                <w:sz w:val="33"/>
+                <w:szCs w:val="40"/>
+              </w:rPr>
+              <w:t>–</w:t>
+            </w:r>
+            <w:r>
+              <w:rPr>
+                <w:rFonts w:ascii="BRH Malayalam Extra" w:hAnsi="BRH Malayalam Extra" w:cs="BRH Malayalam Extra"/>
+                <w:color w:val="000000"/>
+                <w:sz w:val="40"/>
+                <w:szCs w:val="40"/>
+              </w:rPr>
+              <w:t xml:space="preserve"> ¤¤öZræ¡—¥hd | </w:t>
+            </w:r>
+          </w:p>
+          <w:p>
+            <w:pPr>
+              <w:widowControl w:val="0"/>
+              <w:autoSpaceDE w:val="0"/>
+              <w:autoSpaceDN w:val="0"/>
+              <w:adjustRightInd w:val="0"/>
+              <w:spacing w:before="0" w:line="240" w:lineRule="auto"/>
+              <w:rPr>
+                <w:rFonts w:ascii="BRH Devanagari Extra" w:hAnsi="BRH Devanagari Extra" w:cs="BRH Devanagari Extra"/>
+                <w:color w:val="000000"/>
+                <w:sz w:val="40"/>
+                <w:szCs w:val="40"/>
+              </w:rPr>
+            </w:pPr>
+            <w:r>
+              <w:rPr>
+                <w:rFonts w:ascii="BRH Malayalam Extra" w:hAnsi="BRH Malayalam Extra" w:cs="BRH Malayalam Extra"/>
+                <w:color w:val="000000"/>
+                <w:sz w:val="40"/>
+                <w:szCs w:val="40"/>
+              </w:rPr>
+              <w:t>¤¤öZræ—</w:t>
+            </w:r>
+            <w:r>
+              <w:rPr>
+                <w:rFonts w:ascii="BRH Malayalam Extra" w:hAnsi="BRH Malayalam Extra" w:cs="BRH Malayalam Extra"/>
+                <w:color w:val="000000"/>
+                <w:sz w:val="40"/>
+                <w:szCs w:val="40"/>
+                <w:highlight w:val="green"/>
+              </w:rPr>
+              <w:t>¡</w:t>
+            </w:r>
+            <w:r>
+              <w:rPr>
+                <w:rFonts w:ascii="BRH Malayalam Extra" w:hAnsi="BRH Malayalam Extra" w:cs="BRH Malayalam Extra"/>
+                <w:color w:val="000000"/>
+                <w:sz w:val="40"/>
+                <w:szCs w:val="40"/>
+              </w:rPr>
+              <w:t>¥hd</w:t>
+            </w:r>
+            <w:r>
+              <w:rPr>
+                <w:rFonts w:ascii="BRH Malayalam Extra" w:hAnsi="BRH Malayalam Extra" w:cs="BRH Malayalam Extra"/>
+                <w:b/>
+                <w:color w:val="000000"/>
+                <w:sz w:val="33"/>
+                <w:szCs w:val="40"/>
+              </w:rPr>
+              <w:t>–</w:t>
+            </w:r>
+            <w:r>
+              <w:rPr>
+                <w:rFonts w:ascii="BRH Malayalam Extra" w:hAnsi="BRH Malayalam Extra" w:cs="BRH Malayalam Extra"/>
+                <w:color w:val="000000"/>
+                <w:sz w:val="40"/>
+                <w:szCs w:val="40"/>
+              </w:rPr>
+              <w:t xml:space="preserve"> QÉ—sx |</w:t>
+            </w:r>
+          </w:p>
+        </w:tc>
+      </w:tr>
+      <w:tr>
+        <w:trPr>
+          <w:trHeight w:val="1407"/>
+        </w:trPr>
+        <w:tc>
+          <w:tcPr>
+            <w:tcW w:w="4048" w:type="dxa"/>
+          </w:tcPr>
+          <w:p>
+            <w:pPr>
+              <w:widowControl w:val="0"/>
+              <w:tabs>
+                <w:tab w:val="left" w:pos="993"/>
+              </w:tabs>
+              <w:autoSpaceDE w:val="0"/>
+              <w:autoSpaceDN w:val="0"/>
+              <w:adjustRightInd w:val="0"/>
+              <w:spacing w:before="0" w:line="240" w:lineRule="auto"/>
+              <w:ind w:right="297"/>
+              <w:rPr>
+                <w:rFonts w:cs="Arial"/>
+                <w:b/>
+                <w:sz w:val="28"/>
+                <w:szCs w:val="32"/>
+              </w:rPr>
+            </w:pPr>
+            <w:r>
+              <w:rPr>
+                <w:rFonts w:cs="Arial"/>
+                <w:b/>
+                <w:sz w:val="28"/>
+                <w:szCs w:val="32"/>
+              </w:rPr>
+              <w:t>T.S.3.3.</w:t>
+            </w:r>
+            <w:r>
+              <w:rPr>
+                <w:rFonts w:cs="Arial"/>
+                <w:b/>
+                <w:sz w:val="28"/>
+                <w:szCs w:val="32"/>
+              </w:rPr>
+              <w:t>8.5</w:t>
+            </w:r>
+            <w:r>
+              <w:rPr>
+                <w:rFonts w:cs="Arial"/>
+                <w:b/>
+                <w:sz w:val="28"/>
+                <w:szCs w:val="32"/>
+              </w:rPr>
+              <w:t xml:space="preserve"> – Kramam</w:t>
+            </w:r>
+          </w:p>
+          <w:p>
+            <w:pPr>
+              <w:widowControl w:val="0"/>
+              <w:tabs>
+                <w:tab w:val="left" w:pos="993"/>
+              </w:tabs>
+              <w:autoSpaceDE w:val="0"/>
+              <w:autoSpaceDN w:val="0"/>
+              <w:adjustRightInd w:val="0"/>
+              <w:spacing w:before="0" w:line="240" w:lineRule="auto"/>
+              <w:ind w:right="297"/>
+              <w:rPr>
+                <w:rFonts w:cs="Arial"/>
+                <w:b/>
+                <w:sz w:val="28"/>
+                <w:szCs w:val="32"/>
+              </w:rPr>
+            </w:pPr>
+            <w:r>
+              <w:rPr>
+                <w:rFonts w:cs="Arial"/>
+                <w:b/>
+                <w:sz w:val="28"/>
+                <w:szCs w:val="32"/>
+              </w:rPr>
+              <w:t xml:space="preserve">Krama Vaakyam No. - </w:t>
+            </w:r>
+            <w:r>
+              <w:rPr>
+                <w:rFonts w:cs="Arial"/>
+                <w:b/>
+                <w:sz w:val="28"/>
+                <w:szCs w:val="32"/>
+              </w:rPr>
+              <w:t>24</w:t>
+            </w:r>
+          </w:p>
+          <w:p>
+            <w:pPr>
+              <w:widowControl w:val="0"/>
+              <w:autoSpaceDE w:val="0"/>
+              <w:autoSpaceDN w:val="0"/>
+              <w:adjustRightInd w:val="0"/>
+              <w:spacing w:before="0" w:line="240" w:lineRule="auto"/>
+              <w:rPr>
+                <w:rFonts w:cs="Arial"/>
+                <w:bCs/>
+                <w:sz w:val="36"/>
+                <w:szCs w:val="36"/>
+                <w:lang w:bidi="ml-IN"/>
+              </w:rPr>
+            </w:pPr>
+            <w:r>
+              <w:rPr>
+                <w:rFonts w:cs="Arial"/>
+                <w:b/>
+                <w:sz w:val="28"/>
+                <w:szCs w:val="32"/>
+              </w:rPr>
+              <w:t>Panchaati No</w:t>
+            </w:r>
+            <w:r>
+              <w:rPr>
+                <w:rFonts w:cs="Arial"/>
+                <w:b/>
+                <w:szCs w:val="32"/>
+              </w:rPr>
+              <w:t>. -</w:t>
+            </w:r>
+            <w:r>
+              <w:rPr>
+                <w:rFonts w:cs="Arial"/>
+                <w:b/>
+                <w:sz w:val="28"/>
+                <w:szCs w:val="28"/>
+              </w:rPr>
+              <w:t xml:space="preserve"> 26</w:t>
+            </w:r>
+          </w:p>
+        </w:tc>
+        <w:tc>
+          <w:tcPr>
+            <w:tcW w:w="4819" w:type="dxa"/>
+          </w:tcPr>
+          <w:p>
+            <w:pPr>
+              <w:widowControl w:val="0"/>
+              <w:autoSpaceDE w:val="0"/>
+              <w:autoSpaceDN w:val="0"/>
+              <w:adjustRightInd w:val="0"/>
+              <w:spacing w:before="0" w:line="240" w:lineRule="auto"/>
+              <w:rPr>
+                <w:rFonts w:ascii="BRH Malayalam Extra" w:hAnsi="BRH Malayalam Extra" w:cs="BRH Malayalam Extra"/>
+                <w:color w:val="000000"/>
+                <w:sz w:val="40"/>
+                <w:szCs w:val="40"/>
+              </w:rPr>
+            </w:pPr>
+            <w:r>
+              <w:rPr>
+                <w:rFonts w:ascii="BRH Malayalam Extra" w:hAnsi="BRH Malayalam Extra" w:cs="BRH Malayalam Extra"/>
+                <w:color w:val="000000"/>
+                <w:sz w:val="40"/>
+                <w:szCs w:val="40"/>
+              </w:rPr>
+              <w:t>px D—eöb</w:t>
+            </w:r>
+            <w:r>
+              <w:rPr>
+                <w:rFonts w:ascii="BRH Malayalam Extra" w:hAnsi="BRH Malayalam Extra" w:cs="BRH Malayalam Extra"/>
+                <w:b/>
+                <w:color w:val="000000"/>
+                <w:sz w:val="33"/>
+                <w:szCs w:val="40"/>
+              </w:rPr>
+              <w:t>–</w:t>
+            </w:r>
+            <w:r>
+              <w:rPr>
+                <w:rFonts w:ascii="BRH Malayalam Extra" w:hAnsi="BRH Malayalam Extra" w:cs="BRH Malayalam Extra"/>
+                <w:color w:val="000000"/>
+                <w:sz w:val="40"/>
+                <w:szCs w:val="40"/>
+              </w:rPr>
+              <w:t>ræxk˜</w:t>
+            </w:r>
+            <w:r>
+              <w:rPr>
+                <w:rFonts w:ascii="BRH Malayalam Extra" w:hAnsi="BRH Malayalam Extra" w:cs="BRH Malayalam Extra"/>
+                <w:color w:val="000000"/>
+                <w:sz w:val="40"/>
+                <w:szCs w:val="40"/>
+              </w:rPr>
+              <w:t>I</w:t>
+            </w:r>
+            <w:r>
+              <w:rPr>
+                <w:rFonts w:ascii="BRH Malayalam Extra" w:hAnsi="BRH Malayalam Extra" w:cs="BRH Malayalam Extra"/>
+                <w:color w:val="000000"/>
+                <w:sz w:val="40"/>
+                <w:szCs w:val="40"/>
+              </w:rPr>
+              <w:t xml:space="preserve"> | </w:t>
+            </w:r>
+          </w:p>
+          <w:p>
+            <w:pPr>
+              <w:widowControl w:val="0"/>
+              <w:autoSpaceDE w:val="0"/>
+              <w:autoSpaceDN w:val="0"/>
+              <w:adjustRightInd w:val="0"/>
+              <w:spacing w:before="0" w:line="240" w:lineRule="auto"/>
+              <w:rPr>
+                <w:rFonts w:ascii="BRH Devanagari Extra" w:hAnsi="BRH Devanagari Extra" w:cs="BRH Devanagari Extra"/>
+                <w:color w:val="000000"/>
+                <w:sz w:val="36"/>
+                <w:szCs w:val="40"/>
+                <w:lang w:val="it-IT" w:bidi="ml-IN"/>
+              </w:rPr>
+            </w:pPr>
+            <w:r>
+              <w:rPr>
+                <w:rFonts w:ascii="BRH Malayalam Extra" w:hAnsi="BRH Malayalam Extra" w:cs="BRH Malayalam Extra"/>
+                <w:color w:val="000000"/>
+                <w:sz w:val="40"/>
+                <w:szCs w:val="40"/>
+                <w:lang w:val="it-IT"/>
+              </w:rPr>
+              <w:t>D</w:t>
+            </w:r>
+            <w:r>
+              <w:rPr>
+                <w:rFonts w:ascii="BRH Malayalam Extra" w:hAnsi="BRH Malayalam Extra" w:cs="BRH Malayalam Extra"/>
+                <w:b/>
+                <w:color w:val="000000"/>
+                <w:sz w:val="33"/>
+                <w:szCs w:val="40"/>
+                <w:lang w:val="it-IT"/>
+              </w:rPr>
+              <w:t>–</w:t>
+            </w:r>
+            <w:r>
+              <w:rPr>
+                <w:rFonts w:ascii="BRH Malayalam Extra" w:hAnsi="BRH Malayalam Extra" w:cs="BRH Malayalam Extra"/>
+                <w:color w:val="000000"/>
+                <w:sz w:val="40"/>
+                <w:szCs w:val="40"/>
+                <w:lang w:val="it-IT"/>
+              </w:rPr>
+              <w:t>e</w:t>
+            </w:r>
+            <w:r>
+              <w:rPr>
+                <w:rFonts w:ascii="BRH Malayalam Extra" w:hAnsi="BRH Malayalam Extra" w:cs="BRH Malayalam Extra"/>
+                <w:b/>
+                <w:color w:val="000000"/>
+                <w:sz w:val="33"/>
+                <w:szCs w:val="40"/>
+                <w:lang w:val="it-IT"/>
+              </w:rPr>
+              <w:t>–</w:t>
+            </w:r>
+            <w:r>
+              <w:rPr>
+                <w:rFonts w:ascii="BRH Malayalam Extra" w:hAnsi="BRH Malayalam Extra" w:cs="BRH Malayalam Extra"/>
+                <w:color w:val="000000"/>
+                <w:sz w:val="40"/>
+                <w:szCs w:val="40"/>
+                <w:lang w:val="it-IT"/>
+              </w:rPr>
+              <w:t>öb</w:t>
+            </w:r>
+            <w:r>
+              <w:rPr>
+                <w:rFonts w:ascii="BRH Malayalam Extra" w:hAnsi="BRH Malayalam Extra" w:cs="BRH Malayalam Extra"/>
+                <w:b/>
+                <w:color w:val="000000"/>
+                <w:sz w:val="33"/>
+                <w:szCs w:val="40"/>
+                <w:lang w:val="it-IT"/>
+              </w:rPr>
+              <w:t>–</w:t>
+            </w:r>
+            <w:r>
+              <w:rPr>
+                <w:rFonts w:ascii="BRH Malayalam Extra" w:hAnsi="BRH Malayalam Extra" w:cs="BRH Malayalam Extra"/>
+                <w:color w:val="000000"/>
+                <w:sz w:val="40"/>
+                <w:szCs w:val="40"/>
+                <w:lang w:val="it-IT"/>
+              </w:rPr>
+              <w:t>ræxk—i¡e¥öqx</w:t>
+            </w:r>
+            <w:r>
+              <w:rPr>
+                <w:rFonts w:ascii="BRH Malayalam Extra" w:hAnsi="BRH Malayalam Extra" w:cs="BRH Malayalam Extra"/>
+                <w:b/>
+                <w:color w:val="000000"/>
+                <w:sz w:val="33"/>
+                <w:szCs w:val="40"/>
+                <w:lang w:val="it-IT"/>
+              </w:rPr>
+              <w:t>–</w:t>
+            </w:r>
+            <w:r>
+              <w:rPr>
+                <w:rFonts w:ascii="BRH Malayalam Extra" w:hAnsi="BRH Malayalam Extra" w:cs="BRH Malayalam Extra"/>
+                <w:color w:val="000000"/>
+                <w:sz w:val="40"/>
+                <w:szCs w:val="40"/>
+                <w:lang w:val="it-IT"/>
+              </w:rPr>
+              <w:t>Zx</w:t>
+            </w:r>
+            <w:r>
+              <w:rPr>
+                <w:rFonts w:ascii="BRH Malayalam Extra" w:hAnsi="BRH Malayalam Extra" w:cs="BRH Malayalam Extra"/>
+                <w:color w:val="000000"/>
+                <w:sz w:val="40"/>
+                <w:szCs w:val="40"/>
+                <w:highlight w:val="yellow"/>
+                <w:lang w:val="it-IT"/>
+              </w:rPr>
+              <w:t>k—I</w:t>
+            </w:r>
+            <w:r>
+              <w:rPr>
+                <w:rFonts w:ascii="BRH Malayalam Extra" w:hAnsi="BRH Malayalam Extra" w:cs="BRH Malayalam Extra"/>
+                <w:color w:val="000000"/>
+                <w:sz w:val="40"/>
+                <w:szCs w:val="40"/>
+                <w:lang w:val="it-IT"/>
+              </w:rPr>
+              <w:t xml:space="preserve"> | </w:t>
+            </w:r>
+          </w:p>
+        </w:tc>
+        <w:tc>
+          <w:tcPr>
+            <w:tcW w:w="5103" w:type="dxa"/>
+          </w:tcPr>
+          <w:p>
+            <w:pPr>
+              <w:widowControl w:val="0"/>
+              <w:autoSpaceDE w:val="0"/>
+              <w:autoSpaceDN w:val="0"/>
+              <w:adjustRightInd w:val="0"/>
+              <w:spacing w:before="0" w:line="240" w:lineRule="auto"/>
+              <w:rPr>
+                <w:rFonts w:ascii="BRH Malayalam Extra" w:hAnsi="BRH Malayalam Extra" w:cs="BRH Malayalam Extra"/>
+                <w:color w:val="000000"/>
+                <w:sz w:val="40"/>
+                <w:szCs w:val="40"/>
+                <w:lang w:val="it-IT"/>
+              </w:rPr>
+            </w:pPr>
+            <w:r>
+              <w:rPr>
+                <w:rFonts w:ascii="BRH Malayalam Extra" w:hAnsi="BRH Malayalam Extra" w:cs="BRH Malayalam Extra"/>
+                <w:color w:val="000000"/>
+                <w:sz w:val="40"/>
+                <w:szCs w:val="40"/>
+                <w:lang w:val="it-IT"/>
+              </w:rPr>
+              <w:t>px D—eöb</w:t>
+            </w:r>
+            <w:r>
+              <w:rPr>
+                <w:rFonts w:ascii="BRH Malayalam Extra" w:hAnsi="BRH Malayalam Extra" w:cs="BRH Malayalam Extra"/>
+                <w:b/>
+                <w:color w:val="000000"/>
+                <w:sz w:val="33"/>
+                <w:szCs w:val="40"/>
+                <w:lang w:val="it-IT"/>
+              </w:rPr>
+              <w:t>–</w:t>
+            </w:r>
+            <w:r>
+              <w:rPr>
+                <w:rFonts w:ascii="BRH Malayalam Extra" w:hAnsi="BRH Malayalam Extra" w:cs="BRH Malayalam Extra"/>
+                <w:color w:val="000000"/>
+                <w:sz w:val="40"/>
+                <w:szCs w:val="40"/>
+                <w:lang w:val="it-IT"/>
+              </w:rPr>
+              <w:t xml:space="preserve">ræxk˜I | </w:t>
+            </w:r>
+          </w:p>
+          <w:p>
+            <w:pPr>
+              <w:widowControl w:val="0"/>
+              <w:autoSpaceDE w:val="0"/>
+              <w:autoSpaceDN w:val="0"/>
+              <w:adjustRightInd w:val="0"/>
+              <w:spacing w:before="0" w:line="240" w:lineRule="auto"/>
+              <w:rPr>
+                <w:rFonts w:ascii="BRH Devanagari Extra" w:hAnsi="BRH Devanagari Extra" w:cs="BRH Devanagari Extra"/>
+                <w:color w:val="000000"/>
+                <w:sz w:val="36"/>
+                <w:szCs w:val="40"/>
+                <w:lang w:val="it-IT" w:bidi="ml-IN"/>
+              </w:rPr>
+            </w:pPr>
+            <w:r>
+              <w:rPr>
+                <w:rFonts w:ascii="BRH Malayalam Extra" w:hAnsi="BRH Malayalam Extra" w:cs="BRH Malayalam Extra"/>
+                <w:color w:val="000000"/>
+                <w:sz w:val="40"/>
+                <w:szCs w:val="40"/>
+                <w:lang w:val="it-IT"/>
+              </w:rPr>
+              <w:t>D</w:t>
+            </w:r>
+            <w:r>
+              <w:rPr>
+                <w:rFonts w:ascii="BRH Malayalam Extra" w:hAnsi="BRH Malayalam Extra" w:cs="BRH Malayalam Extra"/>
+                <w:b/>
+                <w:color w:val="000000"/>
+                <w:sz w:val="33"/>
+                <w:szCs w:val="40"/>
+                <w:lang w:val="it-IT"/>
+              </w:rPr>
+              <w:t>–</w:t>
+            </w:r>
+            <w:r>
+              <w:rPr>
+                <w:rFonts w:ascii="BRH Malayalam Extra" w:hAnsi="BRH Malayalam Extra" w:cs="BRH Malayalam Extra"/>
+                <w:color w:val="000000"/>
+                <w:sz w:val="40"/>
+                <w:szCs w:val="40"/>
+                <w:lang w:val="it-IT"/>
+              </w:rPr>
+              <w:t>e</w:t>
+            </w:r>
+            <w:r>
+              <w:rPr>
+                <w:rFonts w:ascii="BRH Malayalam Extra" w:hAnsi="BRH Malayalam Extra" w:cs="BRH Malayalam Extra"/>
+                <w:b/>
+                <w:color w:val="000000"/>
+                <w:sz w:val="33"/>
+                <w:szCs w:val="40"/>
+                <w:lang w:val="it-IT"/>
+              </w:rPr>
+              <w:t>–</w:t>
+            </w:r>
+            <w:r>
+              <w:rPr>
+                <w:rFonts w:ascii="BRH Malayalam Extra" w:hAnsi="BRH Malayalam Extra" w:cs="BRH Malayalam Extra"/>
+                <w:color w:val="000000"/>
+                <w:sz w:val="40"/>
+                <w:szCs w:val="40"/>
+                <w:lang w:val="it-IT"/>
+              </w:rPr>
+              <w:t>öb</w:t>
+            </w:r>
+            <w:r>
+              <w:rPr>
+                <w:rFonts w:ascii="BRH Malayalam Extra" w:hAnsi="BRH Malayalam Extra" w:cs="BRH Malayalam Extra"/>
+                <w:b/>
+                <w:color w:val="000000"/>
+                <w:sz w:val="33"/>
+                <w:szCs w:val="40"/>
+                <w:lang w:val="it-IT"/>
+              </w:rPr>
+              <w:t>–</w:t>
+            </w:r>
+            <w:r>
+              <w:rPr>
+                <w:rFonts w:ascii="BRH Malayalam Extra" w:hAnsi="BRH Malayalam Extra" w:cs="BRH Malayalam Extra"/>
+                <w:color w:val="000000"/>
+                <w:sz w:val="40"/>
+                <w:szCs w:val="40"/>
+                <w:lang w:val="it-IT"/>
+              </w:rPr>
+              <w:t>ræxk—i¡e¥öqx</w:t>
+            </w:r>
+            <w:r>
+              <w:rPr>
+                <w:rFonts w:ascii="BRH Malayalam Extra" w:hAnsi="BRH Malayalam Extra" w:cs="BRH Malayalam Extra"/>
+                <w:b/>
+                <w:color w:val="000000"/>
+                <w:sz w:val="33"/>
+                <w:szCs w:val="40"/>
+                <w:lang w:val="it-IT"/>
+              </w:rPr>
+              <w:t>–</w:t>
+            </w:r>
+            <w:r>
+              <w:rPr>
+                <w:rFonts w:ascii="BRH Malayalam Extra" w:hAnsi="BRH Malayalam Extra" w:cs="BRH Malayalam Extra"/>
+                <w:color w:val="000000"/>
+                <w:sz w:val="40"/>
+                <w:szCs w:val="40"/>
+                <w:lang w:val="it-IT"/>
+              </w:rPr>
+              <w:t>Zx</w:t>
+            </w:r>
+            <w:r>
+              <w:rPr>
+                <w:rFonts w:ascii="BRH Malayalam Extra" w:hAnsi="BRH Malayalam Extra" w:cs="BRH Malayalam Extra"/>
+                <w:color w:val="000000"/>
+                <w:sz w:val="40"/>
+                <w:szCs w:val="40"/>
+                <w:highlight w:val="green"/>
+                <w:lang w:val="it-IT"/>
+              </w:rPr>
+              <w:t>k˜</w:t>
+            </w:r>
+            <w:r>
+              <w:rPr>
+                <w:rFonts w:ascii="BRH Malayalam Extra" w:hAnsi="BRH Malayalam Extra" w:cs="BRH Malayalam Extra"/>
+                <w:color w:val="000000"/>
+                <w:sz w:val="40"/>
+                <w:szCs w:val="40"/>
+                <w:lang w:val="it-IT"/>
+              </w:rPr>
+              <w:t>I |</w:t>
+            </w:r>
+          </w:p>
+        </w:tc>
+      </w:tr>
+    </w:tbl>
+    <w:p>
+      <w:pPr>
+        <w:spacing w:before="0" w:line="240" w:lineRule="auto"/>
+        <w:jc w:val="center"/>
+        <w:rPr>
+          <w:b/>
+          <w:bCs/>
+          <w:sz w:val="32"/>
+          <w:szCs w:val="32"/>
+          <w:u w:val="single"/>
+          <w:lang w:val="it-IT"/>
+        </w:rPr>
+      </w:pPr>
+    </w:p>
+    <w:p>
+      <w:pPr>
+        <w:spacing w:before="0" w:line="240" w:lineRule="auto"/>
+        <w:jc w:val="center"/>
+        <w:rPr>
+          <w:b/>
+          <w:bCs/>
+          <w:sz w:val="32"/>
+          <w:szCs w:val="32"/>
+          <w:u w:val="single"/>
+          <w:lang w:val="it-IT"/>
+        </w:rPr>
+      </w:pPr>
+    </w:p>
+    <w:p>
+      <w:pPr>
+        <w:spacing w:before="0" w:line="240" w:lineRule="auto"/>
+        <w:jc w:val="center"/>
+        <w:rPr>
+          <w:b/>
+          <w:bCs/>
+          <w:sz w:val="32"/>
+          <w:szCs w:val="32"/>
+          <w:u w:val="single"/>
+          <w:lang w:val="it-IT"/>
+        </w:rPr>
+      </w:pPr>
+    </w:p>
+    <w:p>
+      <w:pPr>
+        <w:spacing w:before="0" w:line="240" w:lineRule="auto"/>
+        <w:jc w:val="center"/>
+        <w:rPr>
+          <w:b/>
+          <w:bCs/>
+          <w:sz w:val="32"/>
+          <w:szCs w:val="32"/>
+          <w:u w:val="single"/>
+          <w:lang w:val="it-IT"/>
+        </w:rPr>
+      </w:pPr>
+    </w:p>
+    <w:p>
+      <w:pPr>
+        <w:spacing w:before="0" w:line="240" w:lineRule="auto"/>
+        <w:jc w:val="center"/>
+        <w:rPr>
+          <w:b/>
+          <w:bCs/>
+          <w:sz w:val="32"/>
+          <w:szCs w:val="32"/>
+          <w:u w:val="single"/>
+        </w:rPr>
+      </w:pPr>
+      <w:r>
+        <w:rPr>
+          <w:b/>
+          <w:bCs/>
+          <w:sz w:val="32"/>
+          <w:szCs w:val="32"/>
+          <w:u w:val="single"/>
+        </w:rPr>
+        <w:t xml:space="preserve">TS </w:t>
+      </w:r>
+      <w:r>
+        <w:rPr>
+          <w:b/>
+          <w:bCs/>
+          <w:sz w:val="32"/>
+          <w:szCs w:val="32"/>
+          <w:u w:val="single"/>
+        </w:rPr>
+        <w:t>Krama</w:t>
+      </w:r>
+      <w:r>
+        <w:rPr>
+          <w:b/>
+          <w:bCs/>
+          <w:sz w:val="32"/>
+          <w:szCs w:val="32"/>
+          <w:u w:val="single"/>
+        </w:rPr>
+        <w:t xml:space="preserve"> Paatam – TS </w:t>
       </w:r>
       <w:r>
         <w:rPr>
@@ -300,7 +1512,6 @@
         <w:tc>
           <w:tcPr>
             <w:tcW w:w="4048" w:type="dxa"/>
-            <w:shd w:val="clear" w:color="auto" w:fill="auto"/>
           </w:tcPr>
           <w:p>
             <w:pPr>
@@ -333,7 +1544,6 @@
         <w:tc>
           <w:tcPr>
             <w:tcW w:w="4819" w:type="dxa"/>
-            <w:shd w:val="clear" w:color="auto" w:fill="auto"/>
           </w:tcPr>
           <w:p>
             <w:pPr>
@@ -366,7 +1576,6 @@
         <w:tc>
           <w:tcPr>
             <w:tcW w:w="5103" w:type="dxa"/>
-            <w:shd w:val="clear" w:color="auto" w:fill="auto"/>
           </w:tcPr>
           <w:p>
             <w:pPr>
@@ -453,9 +1662,9 @@
           <w:szCs w:val="32"/>
           <w:u w:val="single"/>
         </w:rPr>
+        <w:lastRenderedPageBreak/>
         <w:t xml:space="preserve">TS </w:t>
       </w:r>
-      <w:proofErr w:type="spellStart"/>
       <w:r>
         <w:rPr>
           <w:b/>
@@ -466,7 +1675,6 @@
         </w:rPr>
         <w:t>Krama</w:t>
       </w:r>
-      <w:proofErr w:type="spellEnd"/>
       <w:r>
         <w:rPr>
           <w:b/>
@@ -475,29 +1683,7 @@
           <w:szCs w:val="32"/>
           <w:u w:val="single"/>
         </w:rPr>
-        <w:t xml:space="preserve"> </w:t>
-      </w:r>
-      <w:proofErr w:type="spellStart"/>
-      <w:r>
-        <w:rPr>
-          <w:b/>
-          <w:bCs/>
-          <w:sz w:val="32"/>
-          <w:szCs w:val="32"/>
-          <w:u w:val="single"/>
-        </w:rPr>
-        <w:t>Paatam</w:t>
-      </w:r>
-      <w:proofErr w:type="spellEnd"/>
-      <w:r>
-        <w:rPr>
-          <w:b/>
-          <w:bCs/>
-          <w:sz w:val="32"/>
-          <w:szCs w:val="32"/>
-          <w:u w:val="single"/>
-        </w:rPr>
-        <w:t xml:space="preserve"> – TS </w:t>
+        <w:t xml:space="preserve"> Paatam – TS </w:t>
       </w:r>
       <w:r>
         <w:rPr>
@@ -737,20 +1923,8 @@
                 <w:sz w:val="28"/>
                 <w:szCs w:val="32"/>
               </w:rPr>
-              <w:t xml:space="preserve">– </w:t>
-            </w:r>
-            <w:proofErr w:type="spellStart"/>
-            <w:r>
-              <w:rPr>
-                <w:rFonts w:cs="Arial"/>
-                <w:b/>
-                <w:color w:val="000000"/>
-                <w:sz w:val="28"/>
-                <w:szCs w:val="32"/>
-              </w:rPr>
-              <w:t>Kramam</w:t>
-            </w:r>
-            <w:proofErr w:type="spellEnd"/>
+              <w:t>– Kramam</w:t>
+            </w:r>
           </w:p>
           <w:p>
             <w:pPr>
@@ -771,49 +1945,15 @@
                 <w:szCs w:val="32"/>
               </w:rPr>
             </w:pPr>
-            <w:proofErr w:type="spellStart"/>
-            <w:r>
-              <w:rPr>
-                <w:rFonts w:cs="Arial"/>
-                <w:b/>
-                <w:color w:val="000000"/>
-                <w:sz w:val="28"/>
-                <w:szCs w:val="32"/>
-              </w:rPr>
-              <w:t>Krama</w:t>
-            </w:r>
-            <w:proofErr w:type="spellEnd"/>
-            <w:r>
-              <w:rPr>
-                <w:rFonts w:cs="Arial"/>
-                <w:b/>
-                <w:color w:val="000000"/>
-                <w:sz w:val="28"/>
-                <w:szCs w:val="32"/>
-              </w:rPr>
-              <w:t xml:space="preserve"> </w:t>
-            </w:r>
-            <w:proofErr w:type="spellStart"/>
-            <w:r>
-              <w:rPr>
-                <w:rFonts w:cs="Arial"/>
-                <w:b/>
-                <w:color w:val="000000"/>
-                <w:sz w:val="28"/>
-                <w:szCs w:val="32"/>
-              </w:rPr>
-              <w:t>Vaakyam</w:t>
-            </w:r>
-            <w:proofErr w:type="spellEnd"/>
-            <w:r>
-              <w:rPr>
-                <w:rFonts w:cs="Arial"/>
-                <w:b/>
-                <w:color w:val="000000"/>
-                <w:sz w:val="28"/>
-                <w:szCs w:val="32"/>
-              </w:rPr>
-              <w:t xml:space="preserve"> No. - </w:t>
+            <w:r>
+              <w:rPr>
+                <w:rFonts w:cs="Arial"/>
+                <w:b/>
+                <w:color w:val="000000"/>
+                <w:sz w:val="28"/>
+                <w:szCs w:val="32"/>
+              </w:rPr>
+              <w:t xml:space="preserve">Krama Vaakyam No. - </w:t>
             </w:r>
             <w:r>
               <w:rPr>
@@ -845,27 +1985,15 @@
                 <w:szCs w:val="32"/>
               </w:rPr>
             </w:pPr>
-            <w:proofErr w:type="spellStart"/>
-            <w:r>
-              <w:rPr>
-                <w:rFonts w:cs="Arial"/>
-                <w:b/>
-                <w:color w:val="000000"/>
-                <w:sz w:val="28"/>
-                <w:szCs w:val="32"/>
-              </w:rPr>
-              <w:t>Panchaati</w:t>
-            </w:r>
-            <w:proofErr w:type="spellEnd"/>
-            <w:r>
-              <w:rPr>
-                <w:rFonts w:cs="Arial"/>
-                <w:b/>
-                <w:color w:val="000000"/>
-                <w:sz w:val="28"/>
-                <w:szCs w:val="32"/>
-              </w:rPr>
-              <w:t xml:space="preserve"> No</w:t>
+            <w:r>
+              <w:rPr>
+                <w:rFonts w:cs="Arial"/>
+                <w:b/>
+                <w:color w:val="000000"/>
+                <w:sz w:val="28"/>
+                <w:szCs w:val="32"/>
+              </w:rPr>
+              <w:t>Panchaati No</w:t>
             </w:r>
             <w:r>
               <w:rPr>
@@ -915,7 +2043,6 @@
                 <w:szCs w:val="40"/>
               </w:rPr>
             </w:pPr>
-            <w:proofErr w:type="spellStart"/>
             <w:r>
               <w:rPr>
                 <w:rFonts w:ascii="BRH Malayalam Extra" w:hAnsi="BRH Malayalam Extra" w:cs="BRH Malayalam Extra"/>
@@ -933,17 +2060,7 @@
                 <w:szCs w:val="40"/>
                 <w:highlight w:val="yellow"/>
               </w:rPr>
-              <w:t>j</w:t>
-            </w:r>
-            <w:proofErr w:type="spellEnd"/>
-            <w:r>
-              <w:rPr>
-                <w:rFonts w:ascii="BRH Malayalam Extra" w:hAnsi="BRH Malayalam Extra" w:cs="BRH Malayalam Extra"/>
-                <w:sz w:val="40"/>
-                <w:szCs w:val="40"/>
-                <w:highlight w:val="yellow"/>
-              </w:rPr>
-              <w:t>¡—</w:t>
+              <w:t>j¡—</w:t>
             </w:r>
             <w:r>
               <w:rPr>
@@ -1054,7 +2171,6 @@
                 <w:szCs w:val="40"/>
               </w:rPr>
             </w:pPr>
-            <w:proofErr w:type="spellStart"/>
             <w:r>
               <w:rPr>
                 <w:rFonts w:ascii="BRH Malayalam Extra" w:hAnsi="BRH Malayalam Extra" w:cs="BRH Malayalam Extra"/>
@@ -1072,29 +2188,8 @@
                 <w:szCs w:val="40"/>
                 <w:highlight w:val="green"/>
               </w:rPr>
-              <w:t>j</w:t>
-            </w:r>
-            <w:proofErr w:type="spellEnd"/>
-            <w:r>
-              <w:rPr>
-                <w:rFonts w:ascii="BRH Malayalam Extra" w:hAnsi="BRH Malayalam Extra" w:cs="BRH Malayalam Extra"/>
-                <w:sz w:val="40"/>
-                <w:szCs w:val="40"/>
-                <w:highlight w:val="green"/>
-              </w:rPr>
-              <w:t>¡—</w:t>
-            </w:r>
-            <w:proofErr w:type="spellStart"/>
-            <w:r>
-              <w:rPr>
-                <w:rFonts w:ascii="BRH Malayalam Extra" w:hAnsi="BRH Malayalam Extra" w:cs="BRH Malayalam Extra"/>
-                <w:sz w:val="40"/>
-                <w:szCs w:val="40"/>
-                <w:highlight w:val="green"/>
-              </w:rPr>
-              <w:t>kx</w:t>
-            </w:r>
-            <w:proofErr w:type="spellEnd"/>
+              <w:t>j¡—kx</w:t>
+            </w:r>
             <w:r>
               <w:rPr>
                 <w:rFonts w:ascii="BRH Malayalam Extra" w:hAnsi="BRH Malayalam Extra" w:cs="BRH Malayalam Extra"/>
@@ -1285,20 +2380,8 @@
                 <w:sz w:val="28"/>
                 <w:szCs w:val="32"/>
               </w:rPr>
-              <w:t xml:space="preserve">– </w:t>
-            </w:r>
-            <w:proofErr w:type="spellStart"/>
-            <w:r>
-              <w:rPr>
-                <w:rFonts w:cs="Arial"/>
-                <w:b/>
-                <w:color w:val="000000"/>
-                <w:sz w:val="28"/>
-                <w:szCs w:val="32"/>
-              </w:rPr>
-              <w:t>Kramam</w:t>
-            </w:r>
-            <w:proofErr w:type="spellEnd"/>
+              <w:t>– Kramam</w:t>
+            </w:r>
           </w:p>
           <w:p>
             <w:pPr>
@@ -1319,49 +2402,15 @@
                 <w:szCs w:val="32"/>
               </w:rPr>
             </w:pPr>
-            <w:proofErr w:type="spellStart"/>
-            <w:r>
-              <w:rPr>
-                <w:rFonts w:cs="Arial"/>
-                <w:b/>
-                <w:color w:val="000000"/>
-                <w:sz w:val="28"/>
-                <w:szCs w:val="32"/>
-              </w:rPr>
-              <w:t>Krama</w:t>
-            </w:r>
-            <w:proofErr w:type="spellEnd"/>
-            <w:r>
-              <w:rPr>
-                <w:rFonts w:cs="Arial"/>
-                <w:b/>
-                <w:color w:val="000000"/>
-                <w:sz w:val="28"/>
-                <w:szCs w:val="32"/>
-              </w:rPr>
-              <w:t xml:space="preserve"> </w:t>
-            </w:r>
-            <w:proofErr w:type="spellStart"/>
-            <w:r>
-              <w:rPr>
-                <w:rFonts w:cs="Arial"/>
-                <w:b/>
-                <w:color w:val="000000"/>
-                <w:sz w:val="28"/>
-                <w:szCs w:val="32"/>
-              </w:rPr>
-              <w:t>Vaakyam</w:t>
-            </w:r>
-            <w:proofErr w:type="spellEnd"/>
-            <w:r>
-              <w:rPr>
-                <w:rFonts w:cs="Arial"/>
-                <w:b/>
-                <w:color w:val="000000"/>
-                <w:sz w:val="28"/>
-                <w:szCs w:val="32"/>
-              </w:rPr>
-              <w:t xml:space="preserve"> No. - </w:t>
+            <w:r>
+              <w:rPr>
+                <w:rFonts w:cs="Arial"/>
+                <w:b/>
+                <w:color w:val="000000"/>
+                <w:sz w:val="28"/>
+                <w:szCs w:val="32"/>
+              </w:rPr>
+              <w:t xml:space="preserve">Krama Vaakyam No. - </w:t>
             </w:r>
             <w:r>
               <w:rPr>
@@ -1403,27 +2452,15 @@
                 <w:szCs w:val="32"/>
               </w:rPr>
             </w:pPr>
-            <w:proofErr w:type="spellStart"/>
-            <w:r>
-              <w:rPr>
-                <w:rFonts w:cs="Arial"/>
-                <w:b/>
-                <w:color w:val="000000"/>
-                <w:sz w:val="28"/>
-                <w:szCs w:val="32"/>
-              </w:rPr>
-              <w:t>Panchaati</w:t>
-            </w:r>
-            <w:proofErr w:type="spellEnd"/>
-            <w:r>
-              <w:rPr>
-                <w:rFonts w:cs="Arial"/>
-                <w:b/>
-                <w:color w:val="000000"/>
-                <w:sz w:val="28"/>
-                <w:szCs w:val="32"/>
-              </w:rPr>
-              <w:t xml:space="preserve"> No</w:t>
+            <w:r>
+              <w:rPr>
+                <w:rFonts w:cs="Arial"/>
+                <w:b/>
+                <w:color w:val="000000"/>
+                <w:sz w:val="28"/>
+                <w:szCs w:val="32"/>
+              </w:rPr>
+              <w:t>Panchaati No</w:t>
             </w:r>
             <w:r>
               <w:rPr>
@@ -1473,7 +2510,6 @@
                 <w:szCs w:val="40"/>
               </w:rPr>
             </w:pPr>
-            <w:proofErr w:type="spellStart"/>
             <w:r>
               <w:rPr>
                 <w:rFonts w:ascii="BRH Malayalam Extra" w:hAnsi="BRH Malayalam Extra" w:cs="BRH Malayalam Extra"/>
@@ -1483,7 +2519,6 @@
               </w:rPr>
               <w:t>py</w:t>
             </w:r>
-            <w:proofErr w:type="spellEnd"/>
             <w:r>
               <w:rPr>
                 <w:rFonts w:ascii="BRH Malayalam Extra" w:hAnsi="BRH Malayalam Extra" w:cs="BRH Malayalam Extra"/>
@@ -1494,25 +2529,14 @@
               </w:rPr>
               <w:t>–</w:t>
             </w:r>
-            <w:proofErr w:type="spellStart"/>
-            <w:r>
-              <w:rPr>
-                <w:rFonts w:ascii="BRH Malayalam Extra" w:hAnsi="BRH Malayalam Extra" w:cs="BRH Malayalam Extra"/>
-                <w:color w:val="000000"/>
-                <w:sz w:val="40"/>
-                <w:szCs w:val="40"/>
-              </w:rPr>
-              <w:t>qûk</w:t>
-            </w:r>
-            <w:proofErr w:type="spellEnd"/>
-            <w:r>
-              <w:rPr>
-                <w:rFonts w:ascii="BRH Malayalam Extra" w:hAnsi="BRH Malayalam Extra" w:cs="BRH Malayalam Extra"/>
-                <w:color w:val="000000"/>
-                <w:sz w:val="40"/>
-                <w:szCs w:val="40"/>
-              </w:rPr>
-              <w:t>¢—e</w:t>
+            <w:r>
+              <w:rPr>
+                <w:rFonts w:ascii="BRH Malayalam Extra" w:hAnsi="BRH Malayalam Extra" w:cs="BRH Malayalam Extra"/>
+                <w:color w:val="000000"/>
+                <w:sz w:val="40"/>
+                <w:szCs w:val="40"/>
+              </w:rPr>
+              <w:t>qûk¢—e</w:t>
             </w:r>
             <w:r>
               <w:rPr>
@@ -1531,19 +2555,8 @@
                 <w:sz w:val="40"/>
                 <w:szCs w:val="40"/>
               </w:rPr>
-              <w:t xml:space="preserve"> CÉ¡—J | </w:t>
-            </w:r>
-            <w:proofErr w:type="spellStart"/>
-            <w:r>
-              <w:rPr>
-                <w:rFonts w:ascii="BRH Malayalam Extra" w:hAnsi="BRH Malayalam Extra" w:cs="BRH Malayalam Extra"/>
-                <w:color w:val="000000"/>
-                <w:sz w:val="40"/>
-                <w:szCs w:val="40"/>
-              </w:rPr>
-              <w:t>py</w:t>
-            </w:r>
-            <w:proofErr w:type="spellEnd"/>
+              <w:t xml:space="preserve"> CÉ¡—J | py</w:t>
+            </w:r>
             <w:r>
               <w:rPr>
                 <w:rFonts w:ascii="BRH Malayalam Extra" w:hAnsi="BRH Malayalam Extra" w:cs="BRH Malayalam Extra"/>
@@ -1554,7 +2567,6 @@
               </w:rPr>
               <w:t>–</w:t>
             </w:r>
-            <w:proofErr w:type="spellStart"/>
             <w:r>
               <w:rPr>
                 <w:rFonts w:ascii="BRH Malayalam Extra" w:hAnsi="BRH Malayalam Extra" w:cs="BRH Malayalam Extra"/>
@@ -1565,7 +2577,6 @@
               </w:rPr>
               <w:t>qû</w:t>
             </w:r>
-            <w:proofErr w:type="spellEnd"/>
             <w:r>
               <w:rPr>
                 <w:rFonts w:ascii="BRH Malayalam Extra" w:hAnsi="BRH Malayalam Extra" w:cs="BRH Malayalam Extra"/>
@@ -1602,39 +2613,8 @@
                 <w:sz w:val="40"/>
                 <w:szCs w:val="40"/>
               </w:rPr>
-              <w:t xml:space="preserve"> </w:t>
-            </w:r>
-            <w:proofErr w:type="spellStart"/>
-            <w:r>
-              <w:rPr>
-                <w:rFonts w:ascii="BRH Malayalam Extra" w:hAnsi="BRH Malayalam Extra" w:cs="BRH Malayalam Extra"/>
-                <w:color w:val="000000"/>
-                <w:sz w:val="40"/>
-                <w:szCs w:val="40"/>
-              </w:rPr>
-              <w:t>CZy</w:t>
-            </w:r>
-            <w:proofErr w:type="spellEnd"/>
-            <w:r>
-              <w:rPr>
-                <w:rFonts w:ascii="BRH Malayalam Extra" w:hAnsi="BRH Malayalam Extra" w:cs="BRH Malayalam Extra"/>
-                <w:color w:val="000000"/>
-                <w:sz w:val="40"/>
-                <w:szCs w:val="40"/>
-              </w:rPr>
-              <w:t xml:space="preserve">— </w:t>
-            </w:r>
-            <w:proofErr w:type="spellStart"/>
-            <w:r>
-              <w:rPr>
-                <w:rFonts w:ascii="BRH Malayalam Extra" w:hAnsi="BRH Malayalam Extra" w:cs="BRH Malayalam Extra"/>
-                <w:color w:val="000000"/>
-                <w:sz w:val="40"/>
-                <w:szCs w:val="40"/>
-              </w:rPr>
-              <w:t>py</w:t>
-            </w:r>
-            <w:proofErr w:type="spellEnd"/>
+              <w:t xml:space="preserve"> CZy— py</w:t>
+            </w:r>
             <w:r>
               <w:rPr>
                 <w:rFonts w:ascii="BRH Malayalam Extra" w:hAnsi="BRH Malayalam Extra" w:cs="BRH Malayalam Extra"/>
@@ -1645,25 +2625,14 @@
               </w:rPr>
               <w:t>–</w:t>
             </w:r>
-            <w:proofErr w:type="spellStart"/>
-            <w:r>
-              <w:rPr>
-                <w:rFonts w:ascii="BRH Malayalam Extra" w:hAnsi="BRH Malayalam Extra" w:cs="BRH Malayalam Extra"/>
-                <w:color w:val="000000"/>
-                <w:sz w:val="40"/>
-                <w:szCs w:val="40"/>
-              </w:rPr>
-              <w:t>qû</w:t>
-            </w:r>
-            <w:proofErr w:type="spellEnd"/>
-            <w:r>
-              <w:rPr>
-                <w:rFonts w:ascii="BRH Malayalam Extra" w:hAnsi="BRH Malayalam Extra" w:cs="BRH Malayalam Extra"/>
-                <w:color w:val="000000"/>
-                <w:sz w:val="40"/>
-                <w:szCs w:val="40"/>
-              </w:rPr>
-              <w:t xml:space="preserve"> - k¢</w:t>
+            <w:r>
+              <w:rPr>
+                <w:rFonts w:ascii="BRH Malayalam Extra" w:hAnsi="BRH Malayalam Extra" w:cs="BRH Malayalam Extra"/>
+                <w:color w:val="000000"/>
+                <w:sz w:val="40"/>
+                <w:szCs w:val="40"/>
+              </w:rPr>
+              <w:t>qû - k¢</w:t>
             </w:r>
             <w:r>
               <w:rPr>
@@ -1719,7 +2688,6 @@
                 <w:szCs w:val="40"/>
               </w:rPr>
             </w:pPr>
-            <w:proofErr w:type="spellStart"/>
             <w:r>
               <w:rPr>
                 <w:rFonts w:ascii="BRH Malayalam Extra" w:hAnsi="BRH Malayalam Extra" w:cs="BRH Malayalam Extra"/>
@@ -1729,7 +2697,6 @@
               </w:rPr>
               <w:t>py</w:t>
             </w:r>
-            <w:proofErr w:type="spellEnd"/>
             <w:r>
               <w:rPr>
                 <w:rFonts w:ascii="BRH Malayalam Extra" w:hAnsi="BRH Malayalam Extra" w:cs="BRH Malayalam Extra"/>
@@ -1740,25 +2707,14 @@
               </w:rPr>
               <w:t>–</w:t>
             </w:r>
-            <w:proofErr w:type="spellStart"/>
-            <w:r>
-              <w:rPr>
-                <w:rFonts w:ascii="BRH Malayalam Extra" w:hAnsi="BRH Malayalam Extra" w:cs="BRH Malayalam Extra"/>
-                <w:color w:val="000000"/>
-                <w:sz w:val="40"/>
-                <w:szCs w:val="40"/>
-              </w:rPr>
-              <w:t>qûk</w:t>
-            </w:r>
-            <w:proofErr w:type="spellEnd"/>
-            <w:r>
-              <w:rPr>
-                <w:rFonts w:ascii="BRH Malayalam Extra" w:hAnsi="BRH Malayalam Extra" w:cs="BRH Malayalam Extra"/>
-                <w:color w:val="000000"/>
-                <w:sz w:val="40"/>
-                <w:szCs w:val="40"/>
-              </w:rPr>
-              <w:t>¢—e</w:t>
+            <w:r>
+              <w:rPr>
+                <w:rFonts w:ascii="BRH Malayalam Extra" w:hAnsi="BRH Malayalam Extra" w:cs="BRH Malayalam Extra"/>
+                <w:color w:val="000000"/>
+                <w:sz w:val="40"/>
+                <w:szCs w:val="40"/>
+              </w:rPr>
+              <w:t>qûk¢—e</w:t>
             </w:r>
             <w:r>
               <w:rPr>
@@ -1777,19 +2733,8 @@
                 <w:sz w:val="40"/>
                 <w:szCs w:val="40"/>
               </w:rPr>
-              <w:t xml:space="preserve"> CÉ¡—J | </w:t>
-            </w:r>
-            <w:proofErr w:type="spellStart"/>
-            <w:r>
-              <w:rPr>
-                <w:rFonts w:ascii="BRH Malayalam Extra" w:hAnsi="BRH Malayalam Extra" w:cs="BRH Malayalam Extra"/>
-                <w:color w:val="000000"/>
-                <w:sz w:val="40"/>
-                <w:szCs w:val="40"/>
-              </w:rPr>
-              <w:t>py</w:t>
-            </w:r>
-            <w:proofErr w:type="spellEnd"/>
+              <w:t xml:space="preserve"> CÉ¡—J | py</w:t>
+            </w:r>
             <w:r>
               <w:rPr>
                 <w:rFonts w:ascii="BRH Malayalam Extra" w:hAnsi="BRH Malayalam Extra" w:cs="BRH Malayalam Extra"/>
@@ -1800,7 +2745,6 @@
               </w:rPr>
               <w:t>–</w:t>
             </w:r>
-            <w:proofErr w:type="spellStart"/>
             <w:r>
               <w:rPr>
                 <w:rFonts w:ascii="BRH Malayalam Extra" w:hAnsi="BRH Malayalam Extra" w:cs="BRH Malayalam Extra"/>
@@ -1818,17 +2762,7 @@
                 <w:sz w:val="40"/>
                 <w:szCs w:val="40"/>
               </w:rPr>
-              <w:t>k</w:t>
-            </w:r>
-            <w:proofErr w:type="spellEnd"/>
-            <w:r>
-              <w:rPr>
-                <w:rFonts w:ascii="BRH Malayalam Extra" w:hAnsi="BRH Malayalam Extra" w:cs="BRH Malayalam Extra"/>
-                <w:color w:val="000000"/>
-                <w:sz w:val="40"/>
-                <w:szCs w:val="40"/>
-              </w:rPr>
-              <w:t>¢—e</w:t>
+              <w:t>k¢—e</w:t>
             </w:r>
             <w:r>
               <w:rPr>
@@ -1847,39 +2781,8 @@
                 <w:sz w:val="40"/>
                 <w:szCs w:val="40"/>
               </w:rPr>
-              <w:t xml:space="preserve"> </w:t>
-            </w:r>
-            <w:proofErr w:type="spellStart"/>
-            <w:r>
-              <w:rPr>
-                <w:rFonts w:ascii="BRH Malayalam Extra" w:hAnsi="BRH Malayalam Extra" w:cs="BRH Malayalam Extra"/>
-                <w:color w:val="000000"/>
-                <w:sz w:val="40"/>
-                <w:szCs w:val="40"/>
-              </w:rPr>
-              <w:t>CZy</w:t>
-            </w:r>
-            <w:proofErr w:type="spellEnd"/>
-            <w:r>
-              <w:rPr>
-                <w:rFonts w:ascii="BRH Malayalam Extra" w:hAnsi="BRH Malayalam Extra" w:cs="BRH Malayalam Extra"/>
-                <w:color w:val="000000"/>
-                <w:sz w:val="40"/>
-                <w:szCs w:val="40"/>
-              </w:rPr>
-              <w:t xml:space="preserve">— </w:t>
-            </w:r>
-            <w:proofErr w:type="spellStart"/>
-            <w:r>
-              <w:rPr>
-                <w:rFonts w:ascii="BRH Malayalam Extra" w:hAnsi="BRH Malayalam Extra" w:cs="BRH Malayalam Extra"/>
-                <w:color w:val="000000"/>
-                <w:sz w:val="40"/>
-                <w:szCs w:val="40"/>
-              </w:rPr>
-              <w:t>py</w:t>
-            </w:r>
-            <w:proofErr w:type="spellEnd"/>
+              <w:t xml:space="preserve"> CZy— py</w:t>
+            </w:r>
             <w:r>
               <w:rPr>
                 <w:rFonts w:ascii="BRH Malayalam Extra" w:hAnsi="BRH Malayalam Extra" w:cs="BRH Malayalam Extra"/>
@@ -1890,25 +2793,14 @@
               </w:rPr>
               <w:t>–</w:t>
             </w:r>
-            <w:proofErr w:type="spellStart"/>
-            <w:r>
-              <w:rPr>
-                <w:rFonts w:ascii="BRH Malayalam Extra" w:hAnsi="BRH Malayalam Extra" w:cs="BRH Malayalam Extra"/>
-                <w:color w:val="000000"/>
-                <w:sz w:val="40"/>
-                <w:szCs w:val="40"/>
-              </w:rPr>
-              <w:t>qû</w:t>
-            </w:r>
-            <w:proofErr w:type="spellEnd"/>
-            <w:r>
-              <w:rPr>
-                <w:rFonts w:ascii="BRH Malayalam Extra" w:hAnsi="BRH Malayalam Extra" w:cs="BRH Malayalam Extra"/>
-                <w:color w:val="000000"/>
-                <w:sz w:val="40"/>
-                <w:szCs w:val="40"/>
-              </w:rPr>
-              <w:t xml:space="preserve"> - k¢</w:t>
+            <w:r>
+              <w:rPr>
+                <w:rFonts w:ascii="BRH Malayalam Extra" w:hAnsi="BRH Malayalam Extra" w:cs="BRH Malayalam Extra"/>
+                <w:color w:val="000000"/>
+                <w:sz w:val="40"/>
+                <w:szCs w:val="40"/>
+              </w:rPr>
+              <w:t>qû - k¢</w:t>
             </w:r>
             <w:r>
               <w:rPr>
@@ -2006,20 +2898,8 @@
                 <w:sz w:val="28"/>
                 <w:szCs w:val="32"/>
               </w:rPr>
-              <w:t xml:space="preserve">– </w:t>
-            </w:r>
-            <w:proofErr w:type="spellStart"/>
-            <w:r>
-              <w:rPr>
-                <w:rFonts w:cs="Arial"/>
-                <w:b/>
-                <w:color w:val="000000"/>
-                <w:sz w:val="28"/>
-                <w:szCs w:val="32"/>
-              </w:rPr>
-              <w:t>Kramam</w:t>
-            </w:r>
-            <w:proofErr w:type="spellEnd"/>
+              <w:t>– Kramam</w:t>
+            </w:r>
           </w:p>
           <w:p>
             <w:pPr>
@@ -2040,49 +2920,15 @@
                 <w:szCs w:val="32"/>
               </w:rPr>
             </w:pPr>
-            <w:proofErr w:type="spellStart"/>
-            <w:r>
-              <w:rPr>
-                <w:rFonts w:cs="Arial"/>
-                <w:b/>
-                <w:color w:val="000000"/>
-                <w:sz w:val="28"/>
-                <w:szCs w:val="32"/>
-              </w:rPr>
-              <w:t>Krama</w:t>
-            </w:r>
-            <w:proofErr w:type="spellEnd"/>
-            <w:r>
-              <w:rPr>
-                <w:rFonts w:cs="Arial"/>
-                <w:b/>
-                <w:color w:val="000000"/>
-                <w:sz w:val="28"/>
-                <w:szCs w:val="32"/>
-              </w:rPr>
-              <w:t xml:space="preserve"> </w:t>
-            </w:r>
-            <w:proofErr w:type="spellStart"/>
-            <w:r>
-              <w:rPr>
-                <w:rFonts w:cs="Arial"/>
-                <w:b/>
-                <w:color w:val="000000"/>
-                <w:sz w:val="28"/>
-                <w:szCs w:val="32"/>
-              </w:rPr>
-              <w:t>Vaakyam</w:t>
-            </w:r>
-            <w:proofErr w:type="spellEnd"/>
-            <w:r>
-              <w:rPr>
-                <w:rFonts w:cs="Arial"/>
-                <w:b/>
-                <w:color w:val="000000"/>
-                <w:sz w:val="28"/>
-                <w:szCs w:val="32"/>
-              </w:rPr>
-              <w:t xml:space="preserve"> No. - </w:t>
+            <w:r>
+              <w:rPr>
+                <w:rFonts w:cs="Arial"/>
+                <w:b/>
+                <w:color w:val="000000"/>
+                <w:sz w:val="28"/>
+                <w:szCs w:val="32"/>
+              </w:rPr>
+              <w:t xml:space="preserve">Krama Vaakyam No. - </w:t>
             </w:r>
             <w:r>
               <w:rPr>
@@ -2114,27 +2960,15 @@
                 <w:szCs w:val="32"/>
               </w:rPr>
             </w:pPr>
-            <w:proofErr w:type="spellStart"/>
-            <w:r>
-              <w:rPr>
-                <w:rFonts w:cs="Arial"/>
-                <w:b/>
-                <w:color w:val="000000"/>
-                <w:sz w:val="28"/>
-                <w:szCs w:val="32"/>
-              </w:rPr>
-              <w:t>Panchaati</w:t>
-            </w:r>
-            <w:proofErr w:type="spellEnd"/>
-            <w:r>
-              <w:rPr>
-                <w:rFonts w:cs="Arial"/>
-                <w:b/>
-                <w:color w:val="000000"/>
-                <w:sz w:val="28"/>
-                <w:szCs w:val="32"/>
-              </w:rPr>
-              <w:t xml:space="preserve"> No</w:t>
+            <w:r>
+              <w:rPr>
+                <w:rFonts w:cs="Arial"/>
+                <w:b/>
+                <w:color w:val="000000"/>
+                <w:sz w:val="28"/>
+                <w:szCs w:val="32"/>
+              </w:rPr>
+              <w:t>Panchaati No</w:t>
             </w:r>
             <w:r>
               <w:rPr>
@@ -2222,7 +3056,6 @@
               </w:rPr>
               <w:t>–</w:t>
             </w:r>
-            <w:proofErr w:type="spellStart"/>
             <w:r>
               <w:rPr>
                 <w:rFonts w:ascii="BRH Malayalam Extra" w:hAnsi="BRH Malayalam Extra" w:cs="BRH Malayalam Extra"/>
@@ -2233,7 +3066,6 @@
               </w:rPr>
               <w:t>pz</w:t>
             </w:r>
-            <w:proofErr w:type="spellEnd"/>
             <w:r>
               <w:rPr>
                 <w:rFonts w:ascii="BRH Malayalam Extra" w:hAnsi="BRH Malayalam Extra" w:cs="BRH Malayalam Extra"/>
@@ -2264,25 +3096,14 @@
               </w:rPr>
               <w:t>–</w:t>
             </w:r>
-            <w:proofErr w:type="spellStart"/>
-            <w:r>
-              <w:rPr>
-                <w:rFonts w:ascii="BRH Malayalam Extra" w:hAnsi="BRH Malayalam Extra" w:cs="BRH Malayalam Extra"/>
-                <w:color w:val="000000"/>
-                <w:sz w:val="40"/>
-                <w:szCs w:val="40"/>
-              </w:rPr>
-              <w:t>pz</w:t>
-            </w:r>
-            <w:proofErr w:type="spellEnd"/>
-            <w:r>
-              <w:rPr>
-                <w:rFonts w:ascii="BRH Malayalam Extra" w:hAnsi="BRH Malayalam Extra" w:cs="BRH Malayalam Extra"/>
-                <w:color w:val="000000"/>
-                <w:sz w:val="40"/>
-                <w:szCs w:val="40"/>
-              </w:rPr>
-              <w:t xml:space="preserve"> s¡</w:t>
+            <w:r>
+              <w:rPr>
+                <w:rFonts w:ascii="BRH Malayalam Extra" w:hAnsi="BRH Malayalam Extra" w:cs="BRH Malayalam Extra"/>
+                <w:color w:val="000000"/>
+                <w:sz w:val="40"/>
+                <w:szCs w:val="40"/>
+              </w:rPr>
+              <w:t>pz s¡</w:t>
             </w:r>
             <w:r>
               <w:rPr>
@@ -2294,25 +3115,14 @@
               </w:rPr>
               <w:t>–</w:t>
             </w:r>
-            <w:proofErr w:type="spellStart"/>
-            <w:r>
-              <w:rPr>
-                <w:rFonts w:ascii="BRH Malayalam Extra" w:hAnsi="BRH Malayalam Extra" w:cs="BRH Malayalam Extra"/>
-                <w:color w:val="000000"/>
-                <w:sz w:val="40"/>
-                <w:szCs w:val="40"/>
-              </w:rPr>
-              <w:t>tpx</w:t>
-            </w:r>
-            <w:proofErr w:type="spellEnd"/>
-            <w:r>
-              <w:rPr>
-                <w:rFonts w:ascii="BRH Malayalam Extra" w:hAnsi="BRH Malayalam Extra" w:cs="BRH Malayalam Extra"/>
-                <w:color w:val="000000"/>
-                <w:sz w:val="40"/>
-                <w:szCs w:val="40"/>
-              </w:rPr>
-              <w:t>˜ |</w:t>
+            <w:r>
+              <w:rPr>
+                <w:rFonts w:ascii="BRH Malayalam Extra" w:hAnsi="BRH Malayalam Extra" w:cs="BRH Malayalam Extra"/>
+                <w:color w:val="000000"/>
+                <w:sz w:val="40"/>
+                <w:szCs w:val="40"/>
+              </w:rPr>
+              <w:t>tpx˜ |</w:t>
             </w:r>
           </w:p>
         </w:tc>
@@ -2368,7 +3178,6 @@
               </w:rPr>
               <w:t>–</w:t>
             </w:r>
-            <w:proofErr w:type="spellStart"/>
             <w:r>
               <w:rPr>
                 <w:rFonts w:ascii="BRH Malayalam Extra" w:hAnsi="BRH Malayalam Extra" w:cs="BRH Malayalam Extra"/>
@@ -2379,7 +3188,6 @@
               </w:rPr>
               <w:t>pz</w:t>
             </w:r>
-            <w:proofErr w:type="spellEnd"/>
             <w:r>
               <w:rPr>
                 <w:rFonts w:ascii="BRH Malayalam Extra" w:hAnsi="BRH Malayalam Extra" w:cs="BRH Malayalam Extra"/>
@@ -2399,25 +3207,14 @@
               </w:rPr>
               <w:t>–</w:t>
             </w:r>
-            <w:proofErr w:type="spellStart"/>
-            <w:r>
-              <w:rPr>
-                <w:rFonts w:ascii="BRH Malayalam Extra" w:hAnsi="BRH Malayalam Extra" w:cs="BRH Malayalam Extra"/>
-                <w:color w:val="000000"/>
-                <w:sz w:val="40"/>
-                <w:szCs w:val="40"/>
-              </w:rPr>
-              <w:t>pz</w:t>
-            </w:r>
-            <w:proofErr w:type="spellEnd"/>
-            <w:r>
-              <w:rPr>
-                <w:rFonts w:ascii="BRH Malayalam Extra" w:hAnsi="BRH Malayalam Extra" w:cs="BRH Malayalam Extra"/>
-                <w:color w:val="000000"/>
-                <w:sz w:val="40"/>
-                <w:szCs w:val="40"/>
-              </w:rPr>
-              <w:t xml:space="preserve"> s¡</w:t>
+            <w:r>
+              <w:rPr>
+                <w:rFonts w:ascii="BRH Malayalam Extra" w:hAnsi="BRH Malayalam Extra" w:cs="BRH Malayalam Extra"/>
+                <w:color w:val="000000"/>
+                <w:sz w:val="40"/>
+                <w:szCs w:val="40"/>
+              </w:rPr>
+              <w:t>pz s¡</w:t>
             </w:r>
             <w:r>
               <w:rPr>
@@ -2429,25 +3226,14 @@
               </w:rPr>
               <w:t>–</w:t>
             </w:r>
-            <w:proofErr w:type="spellStart"/>
-            <w:r>
-              <w:rPr>
-                <w:rFonts w:ascii="BRH Malayalam Extra" w:hAnsi="BRH Malayalam Extra" w:cs="BRH Malayalam Extra"/>
-                <w:color w:val="000000"/>
-                <w:sz w:val="40"/>
-                <w:szCs w:val="40"/>
-              </w:rPr>
-              <w:t>tpx</w:t>
-            </w:r>
-            <w:proofErr w:type="spellEnd"/>
-            <w:r>
-              <w:rPr>
-                <w:rFonts w:ascii="BRH Malayalam Extra" w:hAnsi="BRH Malayalam Extra" w:cs="BRH Malayalam Extra"/>
-                <w:color w:val="000000"/>
-                <w:sz w:val="40"/>
-                <w:szCs w:val="40"/>
-              </w:rPr>
-              <w:t>˜ |</w:t>
+            <w:r>
+              <w:rPr>
+                <w:rFonts w:ascii="BRH Malayalam Extra" w:hAnsi="BRH Malayalam Extra" w:cs="BRH Malayalam Extra"/>
+                <w:color w:val="000000"/>
+                <w:sz w:val="40"/>
+                <w:szCs w:val="40"/>
+              </w:rPr>
+              <w:t>tpx˜ |</w:t>
             </w:r>
           </w:p>
         </w:tc>
@@ -2479,10 +3265,35 @@
           <w:szCs w:val="40"/>
           <w:lang w:val="en-IN" w:eastAsia="en-IN"/>
         </w:rPr>
-        <w:lastRenderedPageBreak/>
-        <w:t>"</w:t>
-      </w:r>
-      <w:proofErr w:type="spellStart"/>
+        <w:t xml:space="preserve">"qï" </w:t>
+      </w:r>
+      <w:r>
+        <w:rPr>
+          <w:b/>
+          <w:bCs/>
+          <w:sz w:val="32"/>
+        </w:rPr>
+        <w:t xml:space="preserve">replaced </w:t>
+      </w:r>
+      <w:proofErr w:type="gramStart"/>
+      <w:r>
+        <w:rPr>
+          <w:b/>
+          <w:bCs/>
+          <w:sz w:val="32"/>
+        </w:rPr>
+        <w:t>with</w:t>
+      </w:r>
+      <w:r>
+        <w:rPr>
+          <w:rFonts w:ascii="BRH Malayalam" w:hAnsi="BRH Malayalam" w:cs="BRH Malayalam"/>
+          <w:color w:val="000000"/>
+          <w:sz w:val="48"/>
+          <w:szCs w:val="40"/>
+          <w:lang w:val="en-IN" w:eastAsia="en-IN"/>
+        </w:rPr>
+        <w:t xml:space="preserve">  </w:t>
+      </w:r>
       <w:r>
         <w:rPr>
           <w:rFonts w:ascii="BRH Malayalam" w:hAnsi="BRH Malayalam" w:cs="BRH Malayalam"/>
@@ -2491,57 +3302,8 @@
           <w:szCs w:val="40"/>
           <w:lang w:val="en-IN" w:eastAsia="en-IN"/>
         </w:rPr>
-        <w:t>qï</w:t>
-      </w:r>
-      <w:proofErr w:type="spellEnd"/>
-      <w:r>
-        <w:rPr>
-          <w:rFonts w:ascii="BRH Malayalam" w:hAnsi="BRH Malayalam" w:cs="BRH Malayalam"/>
-          <w:color w:val="000000"/>
-          <w:sz w:val="40"/>
-          <w:szCs w:val="40"/>
-          <w:lang w:val="en-IN" w:eastAsia="en-IN"/>
-        </w:rPr>
-        <w:t xml:space="preserve">" </w:t>
-      </w:r>
-      <w:r>
-        <w:rPr>
-          <w:b/>
-          <w:bCs/>
-          <w:sz w:val="32"/>
-        </w:rPr>
-        <w:t xml:space="preserve">replaced </w:t>
-      </w:r>
-      <w:proofErr w:type="gramStart"/>
-      <w:r>
-        <w:rPr>
-          <w:b/>
-          <w:bCs/>
-          <w:sz w:val="32"/>
-        </w:rPr>
-        <w:t>with</w:t>
-      </w:r>
-      <w:r>
-        <w:rPr>
-          <w:rFonts w:ascii="BRH Malayalam" w:hAnsi="BRH Malayalam" w:cs="BRH Malayalam"/>
-          <w:color w:val="000000"/>
-          <w:sz w:val="48"/>
-          <w:szCs w:val="40"/>
-          <w:lang w:val="en-IN" w:eastAsia="en-IN"/>
-        </w:rPr>
-        <w:t xml:space="preserve">  </w:t>
-      </w:r>
-      <w:r>
-        <w:rPr>
-          <w:rFonts w:ascii="BRH Malayalam" w:hAnsi="BRH Malayalam" w:cs="BRH Malayalam"/>
-          <w:color w:val="000000"/>
-          <w:sz w:val="40"/>
-          <w:szCs w:val="40"/>
-          <w:lang w:val="en-IN" w:eastAsia="en-IN"/>
-        </w:rPr>
         <w:t>"</w:t>
       </w:r>
-      <w:proofErr w:type="spellStart"/>
       <w:proofErr w:type="gramEnd"/>
       <w:r>
         <w:rPr>
@@ -2554,7 +3316,7 @@
         </w:rPr>
         <w:t>q§T</w:t>
       </w:r>
-      <w:proofErr w:type="spellEnd"/>
+      <w:proofErr w:type="gramStart"/>
       <w:r>
         <w:rPr>
           <w:rFonts w:ascii="BRH Malayalam" w:hAnsi="BRH Malayalam" w:cs="BRH Malayalam"/>
@@ -2571,7 +3333,16 @@
           <w:bCs/>
           <w:sz w:val="32"/>
         </w:rPr>
-        <w:t>wherever applicable</w:t>
+        <w:t>wherever</w:t>
+      </w:r>
+      <w:proofErr w:type="gramEnd"/>
+      <w:r>
+        <w:rPr>
+          <w:b/>
+          <w:bCs/>
+          <w:sz w:val="32"/>
+        </w:rPr>
+        <w:t xml:space="preserve"> applicable</w:t>
       </w:r>
     </w:p>
     <w:p>
@@ -2615,51 +3386,7 @@
           <w:szCs w:val="32"/>
           <w:u w:val="single"/>
         </w:rPr>
-        <w:t xml:space="preserve">TS </w:t>
-      </w:r>
-      <w:proofErr w:type="spellStart"/>
-      <w:r>
-        <w:rPr>
-          <w:b/>
-          <w:bCs/>
-          <w:sz w:val="28"/>
-          <w:szCs w:val="32"/>
-          <w:u w:val="single"/>
-        </w:rPr>
-        <w:t>Krama</w:t>
-      </w:r>
-      <w:proofErr w:type="spellEnd"/>
-      <w:r>
-        <w:rPr>
-          <w:b/>
-          <w:bCs/>
-          <w:sz w:val="28"/>
-          <w:szCs w:val="32"/>
-          <w:u w:val="single"/>
-        </w:rPr>
-        <w:t xml:space="preserve"> </w:t>
-      </w:r>
-      <w:proofErr w:type="spellStart"/>
-      <w:r>
-        <w:rPr>
-          <w:b/>
-          <w:bCs/>
-          <w:sz w:val="28"/>
-          <w:szCs w:val="32"/>
-          <w:u w:val="single"/>
-        </w:rPr>
-        <w:t>Paatam</w:t>
-      </w:r>
-      <w:proofErr w:type="spellEnd"/>
-      <w:r>
-        <w:rPr>
-          <w:b/>
-          <w:bCs/>
-          <w:sz w:val="28"/>
-          <w:szCs w:val="32"/>
-          <w:u w:val="single"/>
-        </w:rPr>
-        <w:t xml:space="preserve"> – TS </w:t>
+        <w:t xml:space="preserve">TS Krama Paatam – TS </w:t>
       </w:r>
       <w:r>
         <w:rPr>
@@ -2783,6 +3510,7 @@
                 <w:sz w:val="32"/>
                 <w:szCs w:val="32"/>
               </w:rPr>
+              <w:lastRenderedPageBreak/>
               <w:t>Reference</w:t>
             </w:r>
           </w:p>
@@ -2808,6 +3536,7 @@
                 <w:sz w:val="32"/>
                 <w:szCs w:val="32"/>
               </w:rPr>
+              <w:lastRenderedPageBreak/>
               <w:t>As Printed</w:t>
             </w:r>
           </w:p>
@@ -2971,10 +3700,7 @@
         <w:t>=========================</w:t>
       </w:r>
     </w:p>
-    <w:p>
-      <w:bookmarkStart w:id="0" w:name="_GoBack"/>
-      <w:bookmarkEnd w:id="0"/>
-    </w:p>
+    <w:p/>
     <w:sectPr>
       <w:headerReference w:type="even" r:id="rId7"/>
       <w:headerReference w:type="default" r:id="rId8"/>
@@ -2990,7 +3716,7 @@
 </file>
 
 <file path=word/endnotes.xml><?xml version="1.0" encoding="utf-8"?>
-<w:endnotes xmlns:wpc="http://schemas.microsoft.com/office/word/2010/wordprocessingCanvas" xmlns:cx="http://schemas.microsoft.com/office/drawing/2014/chartex" xmlns:cx1="http://schemas.microsoft.com/office/drawing/2015/9/8/chartex" xmlns:mc="http://schemas.openxmlformats.org/markup-compatibility/2006" xmlns:o="urn:schemas-microsoft-com:office:office" xmlns:r="http://schemas.openxmlformats.org/officeDocument/2006/relationships" xmlns:m="http://schemas.openxmlformats.org/officeDocument/2006/math" xmlns:v="urn:schemas-microsoft-com:vml" xmlns:wp14="http://schemas.microsoft.com/office/word/2010/wordprocessingDrawing" xmlns:wp="http://schemas.openxmlformats.org/drawingml/2006/wordprocessingDrawing" xmlns:w10="urn:schemas-microsoft-com:office:word" xmlns:w="http://schemas.openxmlformats.org/wordprocessingml/2006/main" xmlns:w14="http://schemas.microsoft.com/office/word/2010/wordml" xmlns:w15="http://schemas.microsoft.com/office/word/2012/wordml" xmlns:w16se="http://schemas.microsoft.com/office/word/2015/wordml/symex" xmlns:wpg="http://schemas.microsoft.com/office/word/2010/wordprocessingGroup" xmlns:wpi="http://schemas.microsoft.com/office/word/2010/wordprocessingInk" xmlns:wne="http://schemas.microsoft.com/office/word/2006/wordml" xmlns:wps="http://schemas.microsoft.com/office/word/2010/wordprocessingShape" mc:Ignorable="w14 w15 w16se wp14">
+<w:endnotes xmlns:wpc="http://schemas.microsoft.com/office/word/2010/wordprocessingCanvas" xmlns:cx="http://schemas.microsoft.com/office/drawing/2014/chartex" xmlns:cx1="http://schemas.microsoft.com/office/drawing/2015/9/8/chartex" xmlns:cx2="http://schemas.microsoft.com/office/drawing/2015/10/21/chartex" xmlns:cx3="http://schemas.microsoft.com/office/drawing/2016/5/9/chartex" xmlns:cx4="http://schemas.microsoft.com/office/drawing/2016/5/10/chartex" xmlns:cx5="http://schemas.microsoft.com/office/drawing/2016/5/11/chartex" xmlns:cx6="http://schemas.microsoft.com/office/drawing/2016/5/12/chartex" xmlns:cx7="http://schemas.microsoft.com/office/drawing/2016/5/13/chartex" xmlns:cx8="http://schemas.microsoft.com/office/drawing/2016/5/14/chartex" xmlns:mc="http://schemas.openxmlformats.org/markup-compatibility/2006" xmlns:aink="http://schemas.microsoft.com/office/drawing/2016/ink" xmlns:am3d="http://schemas.microsoft.com/office/drawing/2017/model3d" xmlns:o="urn:schemas-microsoft-com:office:office" xmlns:oel="http://schemas.microsoft.com/office/2019/extlst" xmlns:r="http://schemas.openxmlformats.org/officeDocument/2006/relationships" xmlns:m="http://schemas.openxmlformats.org/officeDocument/2006/math" xmlns:v="urn:schemas-microsoft-com:vml" xmlns:wp14="http://schemas.microsoft.com/office/word/2010/wordprocessingDrawing" xmlns:wp="http://schemas.openxmlformats.org/drawingml/2006/wordprocessingDrawing" xmlns:w10="urn:schemas-microsoft-com:office:word" xmlns:w="http://schemas.openxmlformats.org/wordprocessingml/2006/main" xmlns:w14="http://schemas.microsoft.com/office/word/2010/wordml" xmlns:w15="http://schemas.microsoft.com/office/word/2012/wordml" xmlns:w16cex="http://schemas.microsoft.com/office/word/2018/wordml/cex" xmlns:w16cid="http://schemas.microsoft.com/office/word/2016/wordml/cid" xmlns:w16="http://schemas.microsoft.com/office/word/2018/wordml" xmlns:w16du="http://schemas.microsoft.com/office/word/2023/wordml/word16du" xmlns:w16sdtdh="http://schemas.microsoft.com/office/word/2020/wordml/sdtdatahash" xmlns:w16sdtfl="http://schemas.microsoft.com/office/word/2024/wordml/sdtformatlock" xmlns:w16se="http://schemas.microsoft.com/office/word/2015/wordml/symex" xmlns:wpg="http://schemas.microsoft.com/office/word/2010/wordprocessingGroup" xmlns:wpi="http://schemas.microsoft.com/office/word/2010/wordprocessingInk" xmlns:wne="http://schemas.microsoft.com/office/word/2006/wordml" xmlns:wps="http://schemas.microsoft.com/office/word/2010/wordprocessingShape" mc:Ignorable="w14 w15 w16se w16cid w16 w16cex w16sdtdh w16sdtfl w16du wp14">
   <w:endnote w:type="separator" w:id="-1">
     <w:p>
       <w:pPr>
@@ -3015,7 +3741,7 @@
 </file>
 
 <file path=word/footer1.xml><?xml version="1.0" encoding="utf-8"?>
-<w:ftr xmlns:wpc="http://schemas.microsoft.com/office/word/2010/wordprocessingCanvas" xmlns:cx="http://schemas.microsoft.com/office/drawing/2014/chartex" xmlns:cx1="http://schemas.microsoft.com/office/drawing/2015/9/8/chartex" xmlns:mc="http://schemas.openxmlformats.org/markup-compatibility/2006" xmlns:o="urn:schemas-microsoft-com:office:office" xmlns:r="http://schemas.openxmlformats.org/officeDocument/2006/relationships" xmlns:m="http://schemas.openxmlformats.org/officeDocument/2006/math" xmlns:v="urn:schemas-microsoft-com:vml" xmlns:wp14="http://schemas.microsoft.com/office/word/2010/wordprocessingDrawing" xmlns:wp="http://schemas.openxmlformats.org/drawingml/2006/wordprocessingDrawing" xmlns:w10="urn:schemas-microsoft-com:office:word" xmlns:w="http://schemas.openxmlformats.org/wordprocessingml/2006/main" xmlns:w14="http://schemas.microsoft.com/office/word/2010/wordml" xmlns:w15="http://schemas.microsoft.com/office/word/2012/wordml" xmlns:w16se="http://schemas.microsoft.com/office/word/2015/wordml/symex" xmlns:wpg="http://schemas.microsoft.com/office/word/2010/wordprocessingGroup" xmlns:wpi="http://schemas.microsoft.com/office/word/2010/wordprocessingInk" xmlns:wne="http://schemas.microsoft.com/office/word/2006/wordml" xmlns:wps="http://schemas.microsoft.com/office/word/2010/wordprocessingShape" mc:Ignorable="w14 w15 w16se wp14">
+<w:ftr xmlns:wpc="http://schemas.microsoft.com/office/word/2010/wordprocessingCanvas" xmlns:cx="http://schemas.microsoft.com/office/drawing/2014/chartex" xmlns:cx1="http://schemas.microsoft.com/office/drawing/2015/9/8/chartex" xmlns:cx2="http://schemas.microsoft.com/office/drawing/2015/10/21/chartex" xmlns:cx3="http://schemas.microsoft.com/office/drawing/2016/5/9/chartex" xmlns:cx4="http://schemas.microsoft.com/office/drawing/2016/5/10/chartex" xmlns:cx5="http://schemas.microsoft.com/office/drawing/2016/5/11/chartex" xmlns:cx6="http://schemas.microsoft.com/office/drawing/2016/5/12/chartex" xmlns:cx7="http://schemas.microsoft.com/office/drawing/2016/5/13/chartex" xmlns:cx8="http://schemas.microsoft.com/office/drawing/2016/5/14/chartex" xmlns:mc="http://schemas.openxmlformats.org/markup-compatibility/2006" xmlns:aink="http://schemas.microsoft.com/office/drawing/2016/ink" xmlns:am3d="http://schemas.microsoft.com/office/drawing/2017/model3d" xmlns:o="urn:schemas-microsoft-com:office:office" xmlns:oel="http://schemas.microsoft.com/office/2019/extlst" xmlns:r="http://schemas.openxmlformats.org/officeDocument/2006/relationships" xmlns:m="http://schemas.openxmlformats.org/officeDocument/2006/math" xmlns:v="urn:schemas-microsoft-com:vml" xmlns:wp14="http://schemas.microsoft.com/office/word/2010/wordprocessingDrawing" xmlns:wp="http://schemas.openxmlformats.org/drawingml/2006/wordprocessingDrawing" xmlns:w10="urn:schemas-microsoft-com:office:word" xmlns:w="http://schemas.openxmlformats.org/wordprocessingml/2006/main" xmlns:w14="http://schemas.microsoft.com/office/word/2010/wordml" xmlns:w15="http://schemas.microsoft.com/office/word/2012/wordml" xmlns:w16cex="http://schemas.microsoft.com/office/word/2018/wordml/cex" xmlns:w16cid="http://schemas.microsoft.com/office/word/2016/wordml/cid" xmlns:w16="http://schemas.microsoft.com/office/word/2018/wordml" xmlns:w16du="http://schemas.microsoft.com/office/word/2023/wordml/word16du" xmlns:w16sdtdh="http://schemas.microsoft.com/office/word/2020/wordml/sdtdatahash" xmlns:w16sdtfl="http://schemas.microsoft.com/office/word/2024/wordml/sdtformatlock" xmlns:w16se="http://schemas.microsoft.com/office/word/2015/wordml/symex" xmlns:wpg="http://schemas.microsoft.com/office/word/2010/wordprocessingGroup" xmlns:wpi="http://schemas.microsoft.com/office/word/2010/wordprocessingInk" xmlns:wne="http://schemas.microsoft.com/office/word/2006/wordml" xmlns:wps="http://schemas.microsoft.com/office/word/2010/wordprocessingShape" mc:Ignorable="w14 w15 w16se w16cid w16 w16cex w16sdtdh w16sdtfl w16du wp14">
   <w:p>
     <w:pPr>
       <w:pBdr>
@@ -3197,7 +3923,7 @@
 </file>
 
 <file path=word/footer2.xml><?xml version="1.0" encoding="utf-8"?>
-<w:ftr xmlns:wpc="http://schemas.microsoft.com/office/word/2010/wordprocessingCanvas" xmlns:cx="http://schemas.microsoft.com/office/drawing/2014/chartex" xmlns:cx1="http://schemas.microsoft.com/office/drawing/2015/9/8/chartex" xmlns:mc="http://schemas.openxmlformats.org/markup-compatibility/2006" xmlns:o="urn:schemas-microsoft-com:office:office" xmlns:r="http://schemas.openxmlformats.org/officeDocument/2006/relationships" xmlns:m="http://schemas.openxmlformats.org/officeDocument/2006/math" xmlns:v="urn:schemas-microsoft-com:vml" xmlns:wp14="http://schemas.microsoft.com/office/word/2010/wordprocessingDrawing" xmlns:wp="http://schemas.openxmlformats.org/drawingml/2006/wordprocessingDrawing" xmlns:w10="urn:schemas-microsoft-com:office:word" xmlns:w="http://schemas.openxmlformats.org/wordprocessingml/2006/main" xmlns:w14="http://schemas.microsoft.com/office/word/2010/wordml" xmlns:w15="http://schemas.microsoft.com/office/word/2012/wordml" xmlns:w16se="http://schemas.microsoft.com/office/word/2015/wordml/symex" xmlns:wpg="http://schemas.microsoft.com/office/word/2010/wordprocessingGroup" xmlns:wpi="http://schemas.microsoft.com/office/word/2010/wordprocessingInk" xmlns:wne="http://schemas.microsoft.com/office/word/2006/wordml" xmlns:wps="http://schemas.microsoft.com/office/word/2010/wordprocessingShape" mc:Ignorable="w14 w15 w16se wp14">
+<w:ftr xmlns:wpc="http://schemas.microsoft.com/office/word/2010/wordprocessingCanvas" xmlns:cx="http://schemas.microsoft.com/office/drawing/2014/chartex" xmlns:cx1="http://schemas.microsoft.com/office/drawing/2015/9/8/chartex" xmlns:cx2="http://schemas.microsoft.com/office/drawing/2015/10/21/chartex" xmlns:cx3="http://schemas.microsoft.com/office/drawing/2016/5/9/chartex" xmlns:cx4="http://schemas.microsoft.com/office/drawing/2016/5/10/chartex" xmlns:cx5="http://schemas.microsoft.com/office/drawing/2016/5/11/chartex" xmlns:cx6="http://schemas.microsoft.com/office/drawing/2016/5/12/chartex" xmlns:cx7="http://schemas.microsoft.com/office/drawing/2016/5/13/chartex" xmlns:cx8="http://schemas.microsoft.com/office/drawing/2016/5/14/chartex" xmlns:mc="http://schemas.openxmlformats.org/markup-compatibility/2006" xmlns:aink="http://schemas.microsoft.com/office/drawing/2016/ink" xmlns:am3d="http://schemas.microsoft.com/office/drawing/2017/model3d" xmlns:o="urn:schemas-microsoft-com:office:office" xmlns:oel="http://schemas.microsoft.com/office/2019/extlst" xmlns:r="http://schemas.openxmlformats.org/officeDocument/2006/relationships" xmlns:m="http://schemas.openxmlformats.org/officeDocument/2006/math" xmlns:v="urn:schemas-microsoft-com:vml" xmlns:wp14="http://schemas.microsoft.com/office/word/2010/wordprocessingDrawing" xmlns:wp="http://schemas.openxmlformats.org/drawingml/2006/wordprocessingDrawing" xmlns:w10="urn:schemas-microsoft-com:office:word" xmlns:w="http://schemas.openxmlformats.org/wordprocessingml/2006/main" xmlns:w14="http://schemas.microsoft.com/office/word/2010/wordml" xmlns:w15="http://schemas.microsoft.com/office/word/2012/wordml" xmlns:w16cex="http://schemas.microsoft.com/office/word/2018/wordml/cex" xmlns:w16cid="http://schemas.microsoft.com/office/word/2016/wordml/cid" xmlns:w16="http://schemas.microsoft.com/office/word/2018/wordml" xmlns:w16du="http://schemas.microsoft.com/office/word/2023/wordml/word16du" xmlns:w16sdtdh="http://schemas.microsoft.com/office/word/2020/wordml/sdtdatahash" xmlns:w16sdtfl="http://schemas.microsoft.com/office/word/2024/wordml/sdtformatlock" xmlns:w16se="http://schemas.microsoft.com/office/word/2015/wordml/symex" xmlns:wpg="http://schemas.microsoft.com/office/word/2010/wordprocessingGroup" xmlns:wpi="http://schemas.microsoft.com/office/word/2010/wordprocessingInk" xmlns:wne="http://schemas.microsoft.com/office/word/2006/wordml" xmlns:wps="http://schemas.microsoft.com/office/word/2010/wordprocessingShape" mc:Ignorable="w14 w15 w16se w16cid w16 w16cex w16sdtdh w16sdtfl w16du wp14">
   <w:p>
     <w:pPr>
       <w:pBdr>
@@ -3400,7 +4126,7 @@
 </file>
 
 <file path=word/footnotes.xml><?xml version="1.0" encoding="utf-8"?>
-<w:footnotes xmlns:wpc="http://schemas.microsoft.com/office/word/2010/wordprocessingCanvas" xmlns:cx="http://schemas.microsoft.com/office/drawing/2014/chartex" xmlns:cx1="http://schemas.microsoft.com/office/drawing/2015/9/8/chartex" xmlns:mc="http://schemas.openxmlformats.org/markup-compatibility/2006" xmlns:o="urn:schemas-microsoft-com:office:office" xmlns:r="http://schemas.openxmlformats.org/officeDocument/2006/relationships" xmlns:m="http://schemas.openxmlformats.org/officeDocument/2006/math" xmlns:v="urn:schemas-microsoft-com:vml" xmlns:wp14="http://schemas.microsoft.com/office/word/2010/wordprocessingDrawing" xmlns:wp="http://schemas.openxmlformats.org/drawingml/2006/wordprocessingDrawing" xmlns:w10="urn:schemas-microsoft-com:office:word" xmlns:w="http://schemas.openxmlformats.org/wordprocessingml/2006/main" xmlns:w14="http://schemas.microsoft.com/office/word/2010/wordml" xmlns:w15="http://schemas.microsoft.com/office/word/2012/wordml" xmlns:w16se="http://schemas.microsoft.com/office/word/2015/wordml/symex" xmlns:wpg="http://schemas.microsoft.com/office/word/2010/wordprocessingGroup" xmlns:wpi="http://schemas.microsoft.com/office/word/2010/wordprocessingInk" xmlns:wne="http://schemas.microsoft.com/office/word/2006/wordml" xmlns:wps="http://schemas.microsoft.com/office/word/2010/wordprocessingShape" mc:Ignorable="w14 w15 w16se wp14">
+<w:footnotes xmlns:wpc="http://schemas.microsoft.com/office/word/2010/wordprocessingCanvas" xmlns:cx="http://schemas.microsoft.com/office/drawing/2014/chartex" xmlns:cx1="http://schemas.microsoft.com/office/drawing/2015/9/8/chartex" xmlns:cx2="http://schemas.microsoft.com/office/drawing/2015/10/21/chartex" xmlns:cx3="http://schemas.microsoft.com/office/drawing/2016/5/9/chartex" xmlns:cx4="http://schemas.microsoft.com/office/drawing/2016/5/10/chartex" xmlns:cx5="http://schemas.microsoft.com/office/drawing/2016/5/11/chartex" xmlns:cx6="http://schemas.microsoft.com/office/drawing/2016/5/12/chartex" xmlns:cx7="http://schemas.microsoft.com/office/drawing/2016/5/13/chartex" xmlns:cx8="http://schemas.microsoft.com/office/drawing/2016/5/14/chartex" xmlns:mc="http://schemas.openxmlformats.org/markup-compatibility/2006" xmlns:aink="http://schemas.microsoft.com/office/drawing/2016/ink" xmlns:am3d="http://schemas.microsoft.com/office/drawing/2017/model3d" xmlns:o="urn:schemas-microsoft-com:office:office" xmlns:oel="http://schemas.microsoft.com/office/2019/extlst" xmlns:r="http://schemas.openxmlformats.org/officeDocument/2006/relationships" xmlns:m="http://schemas.openxmlformats.org/officeDocument/2006/math" xmlns:v="urn:schemas-microsoft-com:vml" xmlns:wp14="http://schemas.microsoft.com/office/word/2010/wordprocessingDrawing" xmlns:wp="http://schemas.openxmlformats.org/drawingml/2006/wordprocessingDrawing" xmlns:w10="urn:schemas-microsoft-com:office:word" xmlns:w="http://schemas.openxmlformats.org/wordprocessingml/2006/main" xmlns:w14="http://schemas.microsoft.com/office/word/2010/wordml" xmlns:w15="http://schemas.microsoft.com/office/word/2012/wordml" xmlns:w16cex="http://schemas.microsoft.com/office/word/2018/wordml/cex" xmlns:w16cid="http://schemas.microsoft.com/office/word/2016/wordml/cid" xmlns:w16="http://schemas.microsoft.com/office/word/2018/wordml" xmlns:w16du="http://schemas.microsoft.com/office/word/2023/wordml/word16du" xmlns:w16sdtdh="http://schemas.microsoft.com/office/word/2020/wordml/sdtdatahash" xmlns:w16sdtfl="http://schemas.microsoft.com/office/word/2024/wordml/sdtformatlock" xmlns:w16se="http://schemas.microsoft.com/office/word/2015/wordml/symex" xmlns:wpg="http://schemas.microsoft.com/office/word/2010/wordprocessingGroup" xmlns:wpi="http://schemas.microsoft.com/office/word/2010/wordprocessingInk" xmlns:wne="http://schemas.microsoft.com/office/word/2006/wordml" xmlns:wps="http://schemas.microsoft.com/office/word/2010/wordprocessingShape" mc:Ignorable="w14 w15 w16se w16cid w16 w16cex w16sdtdh w16sdtfl w16du wp14">
   <w:footnote w:type="separator" w:id="-1">
     <w:p>
       <w:pPr>
@@ -3425,7 +4151,7 @@
 </file>
 
 <file path=word/header1.xml><?xml version="1.0" encoding="utf-8"?>
-<w:hdr xmlns:wpc="http://schemas.microsoft.com/office/word/2010/wordprocessingCanvas" xmlns:cx="http://schemas.microsoft.com/office/drawing/2014/chartex" xmlns:cx1="http://schemas.microsoft.com/office/drawing/2015/9/8/chartex" xmlns:mc="http://schemas.openxmlformats.org/markup-compatibility/2006" xmlns:o="urn:schemas-microsoft-com:office:office" xmlns:r="http://schemas.openxmlformats.org/officeDocument/2006/relationships" xmlns:m="http://schemas.openxmlformats.org/officeDocument/2006/math" xmlns:v="urn:schemas-microsoft-com:vml" xmlns:wp14="http://schemas.microsoft.com/office/word/2010/wordprocessingDrawing" xmlns:wp="http://schemas.openxmlformats.org/drawingml/2006/wordprocessingDrawing" xmlns:w10="urn:schemas-microsoft-com:office:word" xmlns:w="http://schemas.openxmlformats.org/wordprocessingml/2006/main" xmlns:w14="http://schemas.microsoft.com/office/word/2010/wordml" xmlns:w15="http://schemas.microsoft.com/office/word/2012/wordml" xmlns:w16se="http://schemas.microsoft.com/office/word/2015/wordml/symex" xmlns:wpg="http://schemas.microsoft.com/office/word/2010/wordprocessingGroup" xmlns:wpi="http://schemas.microsoft.com/office/word/2010/wordprocessingInk" xmlns:wne="http://schemas.microsoft.com/office/word/2006/wordml" xmlns:wps="http://schemas.microsoft.com/office/word/2010/wordprocessingShape" mc:Ignorable="w14 w15 w16se wp14">
+<w:hdr xmlns:wpc="http://schemas.microsoft.com/office/word/2010/wordprocessingCanvas" xmlns:cx="http://schemas.microsoft.com/office/drawing/2014/chartex" xmlns:cx1="http://schemas.microsoft.com/office/drawing/2015/9/8/chartex" xmlns:cx2="http://schemas.microsoft.com/office/drawing/2015/10/21/chartex" xmlns:cx3="http://schemas.microsoft.com/office/drawing/2016/5/9/chartex" xmlns:cx4="http://schemas.microsoft.com/office/drawing/2016/5/10/chartex" xmlns:cx5="http://schemas.microsoft.com/office/drawing/2016/5/11/chartex" xmlns:cx6="http://schemas.microsoft.com/office/drawing/2016/5/12/chartex" xmlns:cx7="http://schemas.microsoft.com/office/drawing/2016/5/13/chartex" xmlns:cx8="http://schemas.microsoft.com/office/drawing/2016/5/14/chartex" xmlns:mc="http://schemas.openxmlformats.org/markup-compatibility/2006" xmlns:aink="http://schemas.microsoft.com/office/drawing/2016/ink" xmlns:am3d="http://schemas.microsoft.com/office/drawing/2017/model3d" xmlns:o="urn:schemas-microsoft-com:office:office" xmlns:oel="http://schemas.microsoft.com/office/2019/extlst" xmlns:r="http://schemas.openxmlformats.org/officeDocument/2006/relationships" xmlns:m="http://schemas.openxmlformats.org/officeDocument/2006/math" xmlns:v="urn:schemas-microsoft-com:vml" xmlns:wp14="http://schemas.microsoft.com/office/word/2010/wordprocessingDrawing" xmlns:wp="http://schemas.openxmlformats.org/drawingml/2006/wordprocessingDrawing" xmlns:w10="urn:schemas-microsoft-com:office:word" xmlns:w="http://schemas.openxmlformats.org/wordprocessingml/2006/main" xmlns:w14="http://schemas.microsoft.com/office/word/2010/wordml" xmlns:w15="http://schemas.microsoft.com/office/word/2012/wordml" xmlns:w16cex="http://schemas.microsoft.com/office/word/2018/wordml/cex" xmlns:w16cid="http://schemas.microsoft.com/office/word/2016/wordml/cid" xmlns:w16="http://schemas.microsoft.com/office/word/2018/wordml" xmlns:w16du="http://schemas.microsoft.com/office/word/2023/wordml/word16du" xmlns:w16sdtdh="http://schemas.microsoft.com/office/word/2020/wordml/sdtdatahash" xmlns:w16sdtfl="http://schemas.microsoft.com/office/word/2024/wordml/sdtformatlock" xmlns:w16se="http://schemas.microsoft.com/office/word/2015/wordml/symex" xmlns:wpg="http://schemas.microsoft.com/office/word/2010/wordprocessingGroup" xmlns:wpi="http://schemas.microsoft.com/office/word/2010/wordprocessingInk" xmlns:wne="http://schemas.microsoft.com/office/word/2006/wordml" xmlns:wps="http://schemas.microsoft.com/office/word/2010/wordprocessingShape" mc:Ignorable="w14 w15 w16se w16cid w16 w16cex w16sdtdh w16sdtfl w16du wp14">
   <w:p>
     <w:pPr>
       <w:pStyle w:val="Header"/>
@@ -3438,7 +4164,7 @@
 </file>
 
 <file path=word/header2.xml><?xml version="1.0" encoding="utf-8"?>
-<w:hdr xmlns:wpc="http://schemas.microsoft.com/office/word/2010/wordprocessingCanvas" xmlns:cx="http://schemas.microsoft.com/office/drawing/2014/chartex" xmlns:cx1="http://schemas.microsoft.com/office/drawing/2015/9/8/chartex" xmlns:mc="http://schemas.openxmlformats.org/markup-compatibility/2006" xmlns:o="urn:schemas-microsoft-com:office:office" xmlns:r="http://schemas.openxmlformats.org/officeDocument/2006/relationships" xmlns:m="http://schemas.openxmlformats.org/officeDocument/2006/math" xmlns:v="urn:schemas-microsoft-com:vml" xmlns:wp14="http://schemas.microsoft.com/office/word/2010/wordprocessingDrawing" xmlns:wp="http://schemas.openxmlformats.org/drawingml/2006/wordprocessingDrawing" xmlns:w10="urn:schemas-microsoft-com:office:word" xmlns:w="http://schemas.openxmlformats.org/wordprocessingml/2006/main" xmlns:w14="http://schemas.microsoft.com/office/word/2010/wordml" xmlns:w15="http://schemas.microsoft.com/office/word/2012/wordml" xmlns:w16se="http://schemas.microsoft.com/office/word/2015/wordml/symex" xmlns:wpg="http://schemas.microsoft.com/office/word/2010/wordprocessingGroup" xmlns:wpi="http://schemas.microsoft.com/office/word/2010/wordprocessingInk" xmlns:wne="http://schemas.microsoft.com/office/word/2006/wordml" xmlns:wps="http://schemas.microsoft.com/office/word/2010/wordprocessingShape" mc:Ignorable="w14 w15 w16se wp14">
+<w:hdr xmlns:wpc="http://schemas.microsoft.com/office/word/2010/wordprocessingCanvas" xmlns:cx="http://schemas.microsoft.com/office/drawing/2014/chartex" xmlns:cx1="http://schemas.microsoft.com/office/drawing/2015/9/8/chartex" xmlns:cx2="http://schemas.microsoft.com/office/drawing/2015/10/21/chartex" xmlns:cx3="http://schemas.microsoft.com/office/drawing/2016/5/9/chartex" xmlns:cx4="http://schemas.microsoft.com/office/drawing/2016/5/10/chartex" xmlns:cx5="http://schemas.microsoft.com/office/drawing/2016/5/11/chartex" xmlns:cx6="http://schemas.microsoft.com/office/drawing/2016/5/12/chartex" xmlns:cx7="http://schemas.microsoft.com/office/drawing/2016/5/13/chartex" xmlns:cx8="http://schemas.microsoft.com/office/drawing/2016/5/14/chartex" xmlns:mc="http://schemas.openxmlformats.org/markup-compatibility/2006" xmlns:aink="http://schemas.microsoft.com/office/drawing/2016/ink" xmlns:am3d="http://schemas.microsoft.com/office/drawing/2017/model3d" xmlns:o="urn:schemas-microsoft-com:office:office" xmlns:oel="http://schemas.microsoft.com/office/2019/extlst" xmlns:r="http://schemas.openxmlformats.org/officeDocument/2006/relationships" xmlns:m="http://schemas.openxmlformats.org/officeDocument/2006/math" xmlns:v="urn:schemas-microsoft-com:vml" xmlns:wp14="http://schemas.microsoft.com/office/word/2010/wordprocessingDrawing" xmlns:wp="http://schemas.openxmlformats.org/drawingml/2006/wordprocessingDrawing" xmlns:w10="urn:schemas-microsoft-com:office:word" xmlns:w="http://schemas.openxmlformats.org/wordprocessingml/2006/main" xmlns:w14="http://schemas.microsoft.com/office/word/2010/wordml" xmlns:w15="http://schemas.microsoft.com/office/word/2012/wordml" xmlns:w16cex="http://schemas.microsoft.com/office/word/2018/wordml/cex" xmlns:w16cid="http://schemas.microsoft.com/office/word/2016/wordml/cid" xmlns:w16="http://schemas.microsoft.com/office/word/2018/wordml" xmlns:w16du="http://schemas.microsoft.com/office/word/2023/wordml/word16du" xmlns:w16sdtdh="http://schemas.microsoft.com/office/word/2020/wordml/sdtdatahash" xmlns:w16sdtfl="http://schemas.microsoft.com/office/word/2024/wordml/sdtformatlock" xmlns:w16se="http://schemas.microsoft.com/office/word/2015/wordml/symex" xmlns:wpg="http://schemas.microsoft.com/office/word/2010/wordprocessingGroup" xmlns:wpi="http://schemas.microsoft.com/office/word/2010/wordprocessingInk" xmlns:wne="http://schemas.microsoft.com/office/word/2006/wordml" xmlns:wps="http://schemas.microsoft.com/office/word/2010/wordprocessingShape" mc:Ignorable="w14 w15 w16se w16cid w16 w16cex w16sdtdh w16sdtfl w16du wp14">
   <w:p>
     <w:pPr>
       <w:pStyle w:val="Header"/>
@@ -3451,7 +4177,7 @@
 </file>
 
 <file path=word/styles.xml><?xml version="1.0" encoding="utf-8"?>
-<w:styles xmlns:mc="http://schemas.openxmlformats.org/markup-compatibility/2006" xmlns:r="http://schemas.openxmlformats.org/officeDocument/2006/relationships" xmlns:w="http://schemas.openxmlformats.org/wordprocessingml/2006/main" xmlns:w14="http://schemas.microsoft.com/office/word/2010/wordml" xmlns:w15="http://schemas.microsoft.com/office/word/2012/wordml" xmlns:w16se="http://schemas.microsoft.com/office/word/2015/wordml/symex" mc:Ignorable="w14 w15 w16se">
+<w:styles xmlns:mc="http://schemas.openxmlformats.org/markup-compatibility/2006" xmlns:r="http://schemas.openxmlformats.org/officeDocument/2006/relationships" xmlns:w="http://schemas.openxmlformats.org/wordprocessingml/2006/main" xmlns:w14="http://schemas.microsoft.com/office/word/2010/wordml" xmlns:w15="http://schemas.microsoft.com/office/word/2012/wordml" xmlns:w16cex="http://schemas.microsoft.com/office/word/2018/wordml/cex" xmlns:w16cid="http://schemas.microsoft.com/office/word/2016/wordml/cid" xmlns:w16="http://schemas.microsoft.com/office/word/2018/wordml" xmlns:w16du="http://schemas.microsoft.com/office/word/2023/wordml/word16du" xmlns:w16sdtdh="http://schemas.microsoft.com/office/word/2020/wordml/sdtdatahash" xmlns:w16sdtfl="http://schemas.microsoft.com/office/word/2024/wordml/sdtformatlock" xmlns:w16se="http://schemas.microsoft.com/office/word/2015/wordml/symex" mc:Ignorable="w14 w15 w16se w16cid w16 w16cex w16sdtdh w16sdtfl w16du">
   <w:docDefaults>
     <w:rPrDefault>
       <w:rPr>
@@ -3461,7 +4187,7 @@
     </w:rPrDefault>
     <w:pPrDefault/>
   </w:docDefaults>
-  <w:latentStyles w:defLockedState="0" w:defUIPriority="99" w:defSemiHidden="0" w:defUnhideWhenUsed="0" w:defQFormat="0" w:count="371">
+  <w:latentStyles w:defLockedState="0" w:defUIPriority="99" w:defSemiHidden="0" w:defUnhideWhenUsed="0" w:defQFormat="0" w:count="376">
     <w:lsdException w:name="Normal" w:uiPriority="0" w:qFormat="1"/>
     <w:lsdException w:name="heading 1" w:uiPriority="9" w:qFormat="1"/>
     <w:lsdException w:name="heading 2" w:semiHidden="1" w:uiPriority="9" w:unhideWhenUsed="1" w:qFormat="1"/>
@@ -3833,6 +4559,11 @@
     <w:lsdException w:name="List Table 5 Dark Accent 6" w:uiPriority="50"/>
     <w:lsdException w:name="List Table 6 Colorful Accent 6" w:uiPriority="51"/>
     <w:lsdException w:name="List Table 7 Colorful Accent 6" w:uiPriority="52"/>
+    <w:lsdException w:name="Mention" w:semiHidden="1" w:unhideWhenUsed="1"/>
+    <w:lsdException w:name="Smart Hyperlink" w:semiHidden="1" w:unhideWhenUsed="1"/>
+    <w:lsdException w:name="Hashtag" w:semiHidden="1" w:unhideWhenUsed="1"/>
+    <w:lsdException w:name="Unresolved Mention" w:semiHidden="1" w:unhideWhenUsed="1"/>
+    <w:lsdException w:name="Smart Link" w:semiHidden="1" w:unhideWhenUsed="1"/>
   </w:latentStyles>
   <w:style w:type="paragraph" w:default="1" w:styleId="Normal">
     <w:name w:val="Normal"/>

</xml_diff>